<commit_message>
windows server dhcp - nem mukodik meg
</commit_message>
<xml_diff>
--- a/Címtár és DHCP szolgáltatás Windowson.docx
+++ b/Címtár és DHCP szolgáltatás Windowson.docx
@@ -30,39 +30,7 @@
           <w:rFonts w:ascii="Times New Roman" w:hAnsi="Times New Roman" w:cs="Times New Roman"/>
           <w:highlight w:val="yellow"/>
         </w:rPr>
-        <w:t>Mi az a címtárszolgáltatás (</w:t>
-      </w:r>
-      <w:proofErr w:type="spellStart"/>
-      <w:r>
-        <w:rPr>
-          <w:rFonts w:ascii="Times New Roman" w:hAnsi="Times New Roman" w:cs="Times New Roman"/>
-          <w:highlight w:val="yellow"/>
-        </w:rPr>
-        <w:t>Active</w:t>
-      </w:r>
-      <w:proofErr w:type="spellEnd"/>
-      <w:r>
-        <w:rPr>
-          <w:rFonts w:ascii="Times New Roman" w:hAnsi="Times New Roman" w:cs="Times New Roman"/>
-          <w:highlight w:val="yellow"/>
-        </w:rPr>
-        <w:t xml:space="preserve"> </w:t>
-      </w:r>
-      <w:proofErr w:type="spellStart"/>
-      <w:r>
-        <w:rPr>
-          <w:rFonts w:ascii="Times New Roman" w:hAnsi="Times New Roman" w:cs="Times New Roman"/>
-          <w:highlight w:val="yellow"/>
-        </w:rPr>
-        <w:t>Directory</w:t>
-      </w:r>
-      <w:proofErr w:type="spellEnd"/>
-      <w:r>
-        <w:rPr>
-          <w:rFonts w:ascii="Times New Roman" w:hAnsi="Times New Roman" w:cs="Times New Roman"/>
-          <w:highlight w:val="yellow"/>
-        </w:rPr>
-        <w:t>)?</w:t>
+        <w:t>Mi az a címtárszolgáltatás (Active Directory)?</w:t>
       </w:r>
     </w:p>
     <w:p>
@@ -128,63 +96,7 @@
         <w:rPr>
           <w:rFonts w:ascii="Times New Roman" w:hAnsi="Times New Roman" w:cs="Times New Roman"/>
         </w:rPr>
-        <w:t xml:space="preserve">A Microsoft megoldása erre az </w:t>
-      </w:r>
-      <w:proofErr w:type="spellStart"/>
-      <w:r>
-        <w:rPr>
-          <w:rFonts w:ascii="Times New Roman" w:hAnsi="Times New Roman" w:cs="Times New Roman"/>
-        </w:rPr>
-        <w:t>Active</w:t>
-      </w:r>
-      <w:proofErr w:type="spellEnd"/>
-      <w:r>
-        <w:rPr>
-          <w:rFonts w:ascii="Times New Roman" w:hAnsi="Times New Roman" w:cs="Times New Roman"/>
-        </w:rPr>
-        <w:t xml:space="preserve"> </w:t>
-      </w:r>
-      <w:proofErr w:type="spellStart"/>
-      <w:r>
-        <w:rPr>
-          <w:rFonts w:ascii="Times New Roman" w:hAnsi="Times New Roman" w:cs="Times New Roman"/>
-        </w:rPr>
-        <w:t>Directory</w:t>
-      </w:r>
-      <w:proofErr w:type="spellEnd"/>
-      <w:r>
-        <w:rPr>
-          <w:rFonts w:ascii="Times New Roman" w:hAnsi="Times New Roman" w:cs="Times New Roman"/>
-        </w:rPr>
-        <w:t xml:space="preserve"> </w:t>
-      </w:r>
-      <w:proofErr w:type="spellStart"/>
-      <w:r>
-        <w:rPr>
-          <w:rFonts w:ascii="Times New Roman" w:hAnsi="Times New Roman" w:cs="Times New Roman"/>
-        </w:rPr>
-        <w:t>Domain</w:t>
-      </w:r>
-      <w:proofErr w:type="spellEnd"/>
-      <w:r>
-        <w:rPr>
-          <w:rFonts w:ascii="Times New Roman" w:hAnsi="Times New Roman" w:cs="Times New Roman"/>
-        </w:rPr>
-        <w:t xml:space="preserve"> </w:t>
-      </w:r>
-      <w:proofErr w:type="spellStart"/>
-      <w:r>
-        <w:rPr>
-          <w:rFonts w:ascii="Times New Roman" w:hAnsi="Times New Roman" w:cs="Times New Roman"/>
-        </w:rPr>
-        <w:t>Services</w:t>
-      </w:r>
-      <w:proofErr w:type="spellEnd"/>
-      <w:r>
-        <w:rPr>
-          <w:rFonts w:ascii="Times New Roman" w:hAnsi="Times New Roman" w:cs="Times New Roman"/>
-        </w:rPr>
-        <w:t xml:space="preserve"> (AD DS)</w:t>
+        <w:t>A Microsoft megoldása erre az Active Directory Domain Services (AD DS)</w:t>
       </w:r>
     </w:p>
     <w:p>
@@ -217,21 +129,7 @@
         <w:rPr>
           <w:rFonts w:ascii="Times New Roman" w:hAnsi="Times New Roman" w:cs="Times New Roman"/>
         </w:rPr>
-        <w:t>Van egy tartomány (</w:t>
-      </w:r>
-      <w:proofErr w:type="spellStart"/>
-      <w:r>
-        <w:rPr>
-          <w:rFonts w:ascii="Times New Roman" w:hAnsi="Times New Roman" w:cs="Times New Roman"/>
-        </w:rPr>
-        <w:t>domain</w:t>
-      </w:r>
-      <w:proofErr w:type="spellEnd"/>
-      <w:r>
-        <w:rPr>
-          <w:rFonts w:ascii="Times New Roman" w:hAnsi="Times New Roman" w:cs="Times New Roman"/>
-        </w:rPr>
-        <w:t xml:space="preserve">), amiben van több ezer felhasználó saját fiókkal </w:t>
+        <w:t xml:space="preserve">Van egy tartomány (domain), amiben van több ezer felhasználó saját fiókkal </w:t>
       </w:r>
     </w:p>
     <w:p>
@@ -287,7 +185,6 @@
           <w:bCs/>
         </w:rPr>
       </w:pPr>
-      <w:proofErr w:type="spellStart"/>
       <w:r>
         <w:rPr>
           <w:rFonts w:ascii="Times New Roman" w:hAnsi="Times New Roman" w:cs="Times New Roman"/>
@@ -295,17 +192,7 @@
           <w:bCs/>
           <w:highlight w:val="yellow"/>
         </w:rPr>
-        <w:t>Milrt</w:t>
-      </w:r>
-      <w:proofErr w:type="spellEnd"/>
-      <w:r>
-        <w:rPr>
-          <w:rFonts w:ascii="Times New Roman" w:hAnsi="Times New Roman" w:cs="Times New Roman"/>
-          <w:b/>
-          <w:bCs/>
-          <w:highlight w:val="yellow"/>
-        </w:rPr>
-        <w:t xml:space="preserve"> fontos?</w:t>
+        <w:t>Milrt fontos?</w:t>
       </w:r>
       <w:r>
         <w:rPr>
@@ -331,21 +218,7 @@
         <w:rPr>
           <w:rFonts w:ascii="Times New Roman" w:hAnsi="Times New Roman" w:cs="Times New Roman"/>
         </w:rPr>
-        <w:t xml:space="preserve">Egy helyen kezelhető minden dolgozó fiókja, </w:t>
-      </w:r>
-      <w:proofErr w:type="spellStart"/>
-      <w:r>
-        <w:rPr>
-          <w:rFonts w:ascii="Times New Roman" w:hAnsi="Times New Roman" w:cs="Times New Roman"/>
-        </w:rPr>
-        <w:t>jelszava</w:t>
-      </w:r>
-      <w:proofErr w:type="spellEnd"/>
-      <w:r>
-        <w:rPr>
-          <w:rFonts w:ascii="Times New Roman" w:hAnsi="Times New Roman" w:cs="Times New Roman"/>
-        </w:rPr>
-        <w:t>, jogosultsága</w:t>
+        <w:t>Egy helyen kezelhető minden dolgozó fiókja, jelszava, jogosultsága</w:t>
       </w:r>
     </w:p>
     <w:p>
@@ -381,21 +254,7 @@
         <w:rPr>
           <w:rFonts w:ascii="Times New Roman" w:hAnsi="Times New Roman" w:cs="Times New Roman"/>
         </w:rPr>
-        <w:t>GPO-</w:t>
-      </w:r>
-      <w:proofErr w:type="spellStart"/>
-      <w:r>
-        <w:rPr>
-          <w:rFonts w:ascii="Times New Roman" w:hAnsi="Times New Roman" w:cs="Times New Roman"/>
-        </w:rPr>
-        <w:t>kon</w:t>
-      </w:r>
-      <w:proofErr w:type="spellEnd"/>
-      <w:r>
-        <w:rPr>
-          <w:rFonts w:ascii="Times New Roman" w:hAnsi="Times New Roman" w:cs="Times New Roman"/>
-        </w:rPr>
-        <w:t xml:space="preserve"> keresztül szabályozható, hogy ki mit csinálhat a gépén</w:t>
+        <w:t>GPO-kon keresztül szabályozható, hogy ki mit csinálhat a gépén</w:t>
       </w:r>
     </w:p>
     <w:p>
@@ -449,21 +308,7 @@
         <w:rPr>
           <w:rFonts w:ascii="Times New Roman" w:hAnsi="Times New Roman" w:cs="Times New Roman"/>
         </w:rPr>
-        <w:t xml:space="preserve">Egyszerűbb jelszókezelés, kevesebb </w:t>
-      </w:r>
-      <w:proofErr w:type="spellStart"/>
-      <w:r>
-        <w:rPr>
-          <w:rFonts w:ascii="Times New Roman" w:hAnsi="Times New Roman" w:cs="Times New Roman"/>
-        </w:rPr>
-        <w:t>helpdesk</w:t>
-      </w:r>
-      <w:proofErr w:type="spellEnd"/>
-      <w:r>
-        <w:rPr>
-          <w:rFonts w:ascii="Times New Roman" w:hAnsi="Times New Roman" w:cs="Times New Roman"/>
-        </w:rPr>
-        <w:t>-hívás</w:t>
+        <w:t>Egyszerűbb jelszókezelés, kevesebb helpdesk-hívás</w:t>
       </w:r>
     </w:p>
     <w:p>
@@ -481,21 +326,7 @@
         <w:rPr>
           <w:rFonts w:ascii="Times New Roman" w:hAnsi="Times New Roman" w:cs="Times New Roman"/>
         </w:rPr>
-        <w:t xml:space="preserve">AD integrálható: Office 365, VPN, belső portálok, HR </w:t>
-      </w:r>
-      <w:proofErr w:type="gramStart"/>
-      <w:r>
-        <w:rPr>
-          <w:rFonts w:ascii="Times New Roman" w:hAnsi="Times New Roman" w:cs="Times New Roman"/>
-        </w:rPr>
-        <w:t>rendszerek,</w:t>
-      </w:r>
-      <w:proofErr w:type="gramEnd"/>
-      <w:r>
-        <w:rPr>
-          <w:rFonts w:ascii="Times New Roman" w:hAnsi="Times New Roman" w:cs="Times New Roman"/>
-        </w:rPr>
-        <w:t xml:space="preserve"> stb.</w:t>
+        <w:t>AD integrálható: Office 365, VPN, belső portálok, HR rendszerek, stb.</w:t>
       </w:r>
     </w:p>
     <w:p>
@@ -542,63 +373,7 @@
         <w:rPr>
           <w:rFonts w:ascii="Times New Roman" w:hAnsi="Times New Roman" w:cs="Times New Roman"/>
         </w:rPr>
-        <w:t>A DHCP (</w:t>
-      </w:r>
-      <w:proofErr w:type="spellStart"/>
-      <w:r>
-        <w:rPr>
-          <w:rFonts w:ascii="Times New Roman" w:hAnsi="Times New Roman" w:cs="Times New Roman"/>
-        </w:rPr>
-        <w:t>Dynamic</w:t>
-      </w:r>
-      <w:proofErr w:type="spellEnd"/>
-      <w:r>
-        <w:rPr>
-          <w:rFonts w:ascii="Times New Roman" w:hAnsi="Times New Roman" w:cs="Times New Roman"/>
-        </w:rPr>
-        <w:t xml:space="preserve"> </w:t>
-      </w:r>
-      <w:proofErr w:type="spellStart"/>
-      <w:r>
-        <w:rPr>
-          <w:rFonts w:ascii="Times New Roman" w:hAnsi="Times New Roman" w:cs="Times New Roman"/>
-        </w:rPr>
-        <w:t>Host</w:t>
-      </w:r>
-      <w:proofErr w:type="spellEnd"/>
-      <w:r>
-        <w:rPr>
-          <w:rFonts w:ascii="Times New Roman" w:hAnsi="Times New Roman" w:cs="Times New Roman"/>
-        </w:rPr>
-        <w:t xml:space="preserve"> </w:t>
-      </w:r>
-      <w:proofErr w:type="spellStart"/>
-      <w:r>
-        <w:rPr>
-          <w:rFonts w:ascii="Times New Roman" w:hAnsi="Times New Roman" w:cs="Times New Roman"/>
-        </w:rPr>
-        <w:t>Configuration</w:t>
-      </w:r>
-      <w:proofErr w:type="spellEnd"/>
-      <w:r>
-        <w:rPr>
-          <w:rFonts w:ascii="Times New Roman" w:hAnsi="Times New Roman" w:cs="Times New Roman"/>
-        </w:rPr>
-        <w:t xml:space="preserve"> </w:t>
-      </w:r>
-      <w:proofErr w:type="spellStart"/>
-      <w:r>
-        <w:rPr>
-          <w:rFonts w:ascii="Times New Roman" w:hAnsi="Times New Roman" w:cs="Times New Roman"/>
-        </w:rPr>
-        <w:t>Protocol</w:t>
-      </w:r>
-      <w:proofErr w:type="spellEnd"/>
-      <w:r>
-        <w:rPr>
-          <w:rFonts w:ascii="Times New Roman" w:hAnsi="Times New Roman" w:cs="Times New Roman"/>
-        </w:rPr>
-        <w:t>) azért fontos, mert automatikusan oszt IP-címeket és más hálózati beállításokat a hálózatra csatlakozó eszközöknek. Ez jelentősen leegyszerűsíti a hálózatkezelést, csökkenti a hibák esélyét, és elengedhetetlen a modern, dinamikus hálózatok működéséhez – különösen egy nagyvállalatnál, mint a Telekom.</w:t>
+        <w:t>A DHCP (Dynamic Host Configuration Protocol) azért fontos, mert automatikusan oszt IP-címeket és más hálózati beállításokat a hálózatra csatlakozó eszközöknek. Ez jelentősen leegyszerűsíti a hálózatkezelést, csökkenti a hibák esélyét, és elengedhetetlen a modern, dinamikus hálózatok működéséhez – különösen egy nagyvállalatnál, mint a Telekom.</w:t>
       </w:r>
     </w:p>
     <w:p>
@@ -612,21 +387,7 @@
         <w:rPr>
           <w:rFonts w:ascii="Times New Roman" w:hAnsi="Times New Roman" w:cs="Times New Roman"/>
         </w:rPr>
-        <w:t>A DHCP működése egy 4 lépéses folyamaton alapul, amit DORA-</w:t>
-      </w:r>
-      <w:proofErr w:type="spellStart"/>
-      <w:r>
-        <w:rPr>
-          <w:rFonts w:ascii="Times New Roman" w:hAnsi="Times New Roman" w:cs="Times New Roman"/>
-        </w:rPr>
-        <w:t>nak</w:t>
-      </w:r>
-      <w:proofErr w:type="spellEnd"/>
-      <w:r>
-        <w:rPr>
-          <w:rFonts w:ascii="Times New Roman" w:hAnsi="Times New Roman" w:cs="Times New Roman"/>
-        </w:rPr>
-        <w:t xml:space="preserve"> hívunk:</w:t>
+        <w:t>A DHCP működése egy 4 lépéses folyamaton alapul, amit DORA-nak hívunk:</w:t>
       </w:r>
     </w:p>
     <w:tbl>
@@ -669,18 +430,8 @@
                 <w:b/>
                 <w:bCs/>
               </w:rPr>
-              <w:t xml:space="preserve">D – </w:t>
+              <w:t>D – Discover</w:t>
             </w:r>
-            <w:proofErr w:type="spellStart"/>
-            <w:r>
-              <w:rPr>
-                <w:rFonts w:ascii="Times New Roman" w:hAnsi="Times New Roman" w:cs="Times New Roman"/>
-                <w:b/>
-                <w:bCs/>
-              </w:rPr>
-              <w:t>Discover</w:t>
-            </w:r>
-            <w:proofErr w:type="spellEnd"/>
           </w:p>
         </w:tc>
         <w:tc>
@@ -727,18 +478,8 @@
                 <w:b/>
                 <w:bCs/>
               </w:rPr>
-              <w:t xml:space="preserve">O – </w:t>
+              <w:t>O – Offer</w:t>
             </w:r>
-            <w:proofErr w:type="spellStart"/>
-            <w:r>
-              <w:rPr>
-                <w:rFonts w:ascii="Times New Roman" w:hAnsi="Times New Roman" w:cs="Times New Roman"/>
-                <w:b/>
-                <w:bCs/>
-              </w:rPr>
-              <w:t>Offer</w:t>
-            </w:r>
-            <w:proofErr w:type="spellEnd"/>
           </w:p>
         </w:tc>
         <w:tc>
@@ -785,18 +526,8 @@
                 <w:b/>
                 <w:bCs/>
               </w:rPr>
-              <w:t xml:space="preserve">R – </w:t>
+              <w:t>R – Request</w:t>
             </w:r>
-            <w:proofErr w:type="spellStart"/>
-            <w:r>
-              <w:rPr>
-                <w:rFonts w:ascii="Times New Roman" w:hAnsi="Times New Roman" w:cs="Times New Roman"/>
-                <w:b/>
-                <w:bCs/>
-              </w:rPr>
-              <w:t>Request</w:t>
-            </w:r>
-            <w:proofErr w:type="spellEnd"/>
           </w:p>
         </w:tc>
         <w:tc>
@@ -843,18 +574,8 @@
                 <w:b/>
                 <w:bCs/>
               </w:rPr>
-              <w:t xml:space="preserve">A – </w:t>
+              <w:t>A – Acknowledge</w:t>
             </w:r>
-            <w:proofErr w:type="spellStart"/>
-            <w:r>
-              <w:rPr>
-                <w:rFonts w:ascii="Times New Roman" w:hAnsi="Times New Roman" w:cs="Times New Roman"/>
-                <w:b/>
-                <w:bCs/>
-              </w:rPr>
-              <w:t>Acknowledge</w:t>
-            </w:r>
-            <w:proofErr w:type="spellEnd"/>
           </w:p>
         </w:tc>
         <w:tc>
@@ -896,9 +617,390 @@
       </w:pPr>
       <w:r>
         <w:rPr>
+          <w:rFonts w:ascii="Times New Roman" w:hAnsi="Times New Roman" w:cs="Times New Roman"/>
+          <w:highlight w:val="red"/>
+        </w:rPr>
+        <w:lastRenderedPageBreak/>
+        <w:t>Alapbeállítások a szerveren</w:t>
+      </w:r>
+      <w:r>
+        <w:rPr>
+          <w:rFonts w:ascii="Times New Roman" w:hAnsi="Times New Roman" w:cs="Times New Roman"/>
+          <w:highlight w:val="red"/>
+        </w:rPr>
+        <w:t>:</w:t>
+      </w:r>
+      <w:r>
+        <w:rPr>
+          <w:rFonts w:ascii="Times New Roman" w:hAnsi="Times New Roman" w:cs="Times New Roman"/>
+        </w:rPr>
+        <w:t xml:space="preserve"> </w:t>
+      </w:r>
+    </w:p>
+    <w:p>
+      <w:pPr>
+        <w:jc w:val="both"/>
+        <w:rPr>
+          <w:rFonts w:ascii="Times New Roman" w:hAnsi="Times New Roman" w:cs="Times New Roman"/>
+        </w:rPr>
+      </w:pPr>
+      <w:r>
+        <w:rPr>
+          <w:rFonts w:ascii="Times New Roman" w:hAnsi="Times New Roman" w:cs="Times New Roman"/>
+        </w:rPr>
+        <w:t>Adok egy IPv4-es címet az Ethernet adapternél a szerveremnek</w:t>
+      </w:r>
+    </w:p>
+    <w:p>
+      <w:pPr>
+        <w:jc w:val="center"/>
+        <w:rPr>
+          <w:rFonts w:ascii="Times New Roman" w:hAnsi="Times New Roman" w:cs="Times New Roman"/>
+        </w:rPr>
+      </w:pPr>
+      <w:r>
+        <w:rPr>
+          <w:rFonts w:ascii="Times New Roman" w:hAnsi="Times New Roman" w:cs="Times New Roman"/>
+        </w:rPr>
+        <w:drawing>
+          <wp:inline distT="0" distB="0" distL="0" distR="0" wp14:anchorId="59EF6222" wp14:editId="68FD59F8">
+            <wp:extent cx="4959605" cy="3733992"/>
+            <wp:effectExtent l="0" t="0" r="0" b="0"/>
+            <wp:docPr id="1618237922" name="Kép 1" descr="A képen szöveg, képernyőkép, szoftver, szám látható&#10;&#10;Előfordulhat, hogy az AI által létrehozott tartalom helytelen."/>
+            <wp:cNvGraphicFramePr>
+              <a:graphicFrameLocks xmlns:a="http://schemas.openxmlformats.org/drawingml/2006/main" noChangeAspect="1"/>
+            </wp:cNvGraphicFramePr>
+            <a:graphic xmlns:a="http://schemas.openxmlformats.org/drawingml/2006/main">
+              <a:graphicData uri="http://schemas.openxmlformats.org/drawingml/2006/picture">
+                <pic:pic xmlns:pic="http://schemas.openxmlformats.org/drawingml/2006/picture">
+                  <pic:nvPicPr>
+                    <pic:cNvPr id="1618237922" name="Kép 1" descr="A képen szöveg, képernyőkép, szoftver, szám látható&#10;&#10;Előfordulhat, hogy az AI által létrehozott tartalom helytelen."/>
+                    <pic:cNvPicPr/>
+                  </pic:nvPicPr>
+                  <pic:blipFill>
+                    <a:blip r:embed="rId7"/>
+                    <a:stretch>
+                      <a:fillRect/>
+                    </a:stretch>
+                  </pic:blipFill>
+                  <pic:spPr>
+                    <a:xfrm>
+                      <a:off x="0" y="0"/>
+                      <a:ext cx="4959605" cy="3733992"/>
+                    </a:xfrm>
+                    <a:prstGeom prst="rect">
+                      <a:avLst/>
+                    </a:prstGeom>
+                  </pic:spPr>
+                </pic:pic>
+              </a:graphicData>
+            </a:graphic>
+          </wp:inline>
+        </w:drawing>
+      </w:r>
+    </w:p>
+    <w:p>
+      <w:pPr>
+        <w:rPr>
+          <w:rFonts w:ascii="Times New Roman" w:hAnsi="Times New Roman" w:cs="Times New Roman"/>
+        </w:rPr>
+      </w:pPr>
+      <w:r>
+        <w:rPr>
+          <w:rFonts w:ascii="Times New Roman" w:hAnsi="Times New Roman" w:cs="Times New Roman"/>
+        </w:rPr>
+        <w:t xml:space="preserve">Beállítottam az időt és a </w:t>
+      </w:r>
+      <w:r>
+        <w:rPr>
+          <w:rFonts w:ascii="Times New Roman" w:hAnsi="Times New Roman" w:cs="Times New Roman"/>
+        </w:rPr>
+        <w:t xml:space="preserve">dátumot. </w:t>
+      </w:r>
+    </w:p>
+    <w:p>
+      <w:pPr>
+        <w:jc w:val="center"/>
+        <w:rPr>
+          <w:rFonts w:ascii="Times New Roman" w:hAnsi="Times New Roman" w:cs="Times New Roman"/>
+        </w:rPr>
+      </w:pPr>
+      <w:r>
+        <w:rPr>
+          <w:rFonts w:ascii="Times New Roman" w:hAnsi="Times New Roman" w:cs="Times New Roman"/>
+        </w:rPr>
+        <w:drawing>
+          <wp:inline distT="0" distB="0" distL="0" distR="0" wp14:anchorId="784DFE4E" wp14:editId="15DEE3DF">
+            <wp:extent cx="3726093" cy="3935896"/>
+            <wp:effectExtent l="0" t="0" r="8255" b="7620"/>
+            <wp:docPr id="430040957" name="Kép 1" descr="A képen szöveg, képernyőkép, óra, szám látható&#10;&#10;Előfordulhat, hogy az AI által létrehozott tartalom helytelen."/>
+            <wp:cNvGraphicFramePr>
+              <a:graphicFrameLocks xmlns:a="http://schemas.openxmlformats.org/drawingml/2006/main" noChangeAspect="1"/>
+            </wp:cNvGraphicFramePr>
+            <a:graphic xmlns:a="http://schemas.openxmlformats.org/drawingml/2006/main">
+              <a:graphicData uri="http://schemas.openxmlformats.org/drawingml/2006/picture">
+                <pic:pic xmlns:pic="http://schemas.openxmlformats.org/drawingml/2006/picture">
+                  <pic:nvPicPr>
+                    <pic:cNvPr id="430040957" name="Kép 1" descr="A képen szöveg, képernyőkép, óra, szám látható&#10;&#10;Előfordulhat, hogy az AI által létrehozott tartalom helytelen."/>
+                    <pic:cNvPicPr/>
+                  </pic:nvPicPr>
+                  <pic:blipFill>
+                    <a:blip r:embed="rId8"/>
+                    <a:stretch>
+                      <a:fillRect/>
+                    </a:stretch>
+                  </pic:blipFill>
+                  <pic:spPr>
+                    <a:xfrm>
+                      <a:off x="0" y="0"/>
+                      <a:ext cx="3733513" cy="3943734"/>
+                    </a:xfrm>
+                    <a:prstGeom prst="rect">
+                      <a:avLst/>
+                    </a:prstGeom>
+                  </pic:spPr>
+                </pic:pic>
+              </a:graphicData>
+            </a:graphic>
+          </wp:inline>
+        </w:drawing>
+      </w:r>
+    </w:p>
+    <w:p>
+      <w:pPr>
+        <w:jc w:val="both"/>
+        <w:rPr>
+          <w:rFonts w:ascii="Times New Roman" w:hAnsi="Times New Roman" w:cs="Times New Roman"/>
+        </w:rPr>
+      </w:pPr>
+      <w:r>
+        <w:rPr>
+          <w:rFonts w:ascii="Times New Roman" w:hAnsi="Times New Roman" w:cs="Times New Roman"/>
+        </w:rPr>
+        <w:lastRenderedPageBreak/>
+        <w:t>Szerver nevét beállítottam, itt látszik a domain is</w:t>
+      </w:r>
+      <w:r>
+        <w:rPr>
+          <w:rFonts w:ascii="Times New Roman" w:hAnsi="Times New Roman" w:cs="Times New Roman"/>
+        </w:rPr>
+        <w:t>, illetve lekérdezetem a beállított dns szervercímet a szerveren</w:t>
+      </w:r>
+      <w:r>
+        <w:rPr>
+          <w:rFonts w:ascii="Times New Roman" w:hAnsi="Times New Roman" w:cs="Times New Roman"/>
+        </w:rPr>
+        <w:t xml:space="preserve">. </w:t>
+      </w:r>
+      <w:r>
+        <w:rPr>
+          <w:rFonts w:ascii="Times New Roman" w:hAnsi="Times New Roman" w:cs="Times New Roman"/>
+        </w:rPr>
+        <w:t xml:space="preserve">Láthatók a harmadik képen a windows szerver beállításai. </w:t>
+      </w:r>
+    </w:p>
+    <w:p>
+      <w:pPr>
+        <w:jc w:val="center"/>
+        <w:rPr>
+          <w:rFonts w:ascii="Times New Roman" w:hAnsi="Times New Roman" w:cs="Times New Roman"/>
+        </w:rPr>
+      </w:pPr>
+      <w:r>
+        <w:rPr>
+          <w:rFonts w:ascii="Times New Roman" w:hAnsi="Times New Roman" w:cs="Times New Roman"/>
+        </w:rPr>
+        <w:drawing>
+          <wp:inline distT="0" distB="0" distL="0" distR="0" wp14:anchorId="22148AD6" wp14:editId="555CDD9A">
+            <wp:extent cx="2512612" cy="2924148"/>
+            <wp:effectExtent l="0" t="0" r="2540" b="0"/>
+            <wp:docPr id="264723046" name="Kép 1" descr="A képen szöveg, elektronika, képernyőkép, szoftver látható&#10;&#10;Előfordulhat, hogy az AI által létrehozott tartalom helytelen."/>
+            <wp:cNvGraphicFramePr>
+              <a:graphicFrameLocks xmlns:a="http://schemas.openxmlformats.org/drawingml/2006/main" noChangeAspect="1"/>
+            </wp:cNvGraphicFramePr>
+            <a:graphic xmlns:a="http://schemas.openxmlformats.org/drawingml/2006/main">
+              <a:graphicData uri="http://schemas.openxmlformats.org/drawingml/2006/picture">
+                <pic:pic xmlns:pic="http://schemas.openxmlformats.org/drawingml/2006/picture">
+                  <pic:nvPicPr>
+                    <pic:cNvPr id="264723046" name="Kép 1" descr="A képen szöveg, elektronika, képernyőkép, szoftver látható&#10;&#10;Előfordulhat, hogy az AI által létrehozott tartalom helytelen."/>
+                    <pic:cNvPicPr/>
+                  </pic:nvPicPr>
+                  <pic:blipFill rotWithShape="1">
+                    <a:blip r:embed="rId9"/>
+                    <a:srcRect t="541" r="14168"/>
+                    <a:stretch>
+                      <a:fillRect/>
+                    </a:stretch>
+                  </pic:blipFill>
+                  <pic:spPr bwMode="auto">
+                    <a:xfrm>
+                      <a:off x="0" y="0"/>
+                      <a:ext cx="2512741" cy="2924298"/>
+                    </a:xfrm>
+                    <a:prstGeom prst="rect">
+                      <a:avLst/>
+                    </a:prstGeom>
+                    <a:ln>
+                      <a:noFill/>
+                    </a:ln>
+                    <a:extLst>
+                      <a:ext uri="{53640926-AAD7-44D8-BBD7-CCE9431645EC}">
+                        <a14:shadowObscured xmlns:a14="http://schemas.microsoft.com/office/drawing/2010/main"/>
+                      </a:ext>
+                    </a:extLst>
+                  </pic:spPr>
+                </pic:pic>
+              </a:graphicData>
+            </a:graphic>
+          </wp:inline>
+        </w:drawing>
+      </w:r>
+    </w:p>
+    <w:p>
+      <w:pPr>
+        <w:jc w:val="center"/>
+        <w:rPr>
+          <w:rFonts w:ascii="Times New Roman" w:hAnsi="Times New Roman" w:cs="Times New Roman"/>
+        </w:rPr>
+      </w:pPr>
+      <w:r>
+        <w:rPr>
+          <w:rFonts w:ascii="Times New Roman" w:hAnsi="Times New Roman" w:cs="Times New Roman"/>
+        </w:rPr>
+        <w:drawing>
+          <wp:inline distT="0" distB="0" distL="0" distR="0" wp14:anchorId="0B3A4EC3" wp14:editId="4384AEE5">
+            <wp:extent cx="4597636" cy="2044805"/>
+            <wp:effectExtent l="0" t="0" r="0" b="0"/>
+            <wp:docPr id="1553177831" name="Kép 1" descr="A képen szöveg, elektronika, képernyőkép, szoftver látható&#10;&#10;Előfordulhat, hogy az AI által létrehozott tartalom helytelen."/>
+            <wp:cNvGraphicFramePr>
+              <a:graphicFrameLocks xmlns:a="http://schemas.openxmlformats.org/drawingml/2006/main" noChangeAspect="1"/>
+            </wp:cNvGraphicFramePr>
+            <a:graphic xmlns:a="http://schemas.openxmlformats.org/drawingml/2006/main">
+              <a:graphicData uri="http://schemas.openxmlformats.org/drawingml/2006/picture">
+                <pic:pic xmlns:pic="http://schemas.openxmlformats.org/drawingml/2006/picture">
+                  <pic:nvPicPr>
+                    <pic:cNvPr id="1553177831" name="Kép 1" descr="A képen szöveg, elektronika, képernyőkép, szoftver látható&#10;&#10;Előfordulhat, hogy az AI által létrehozott tartalom helytelen."/>
+                    <pic:cNvPicPr/>
+                  </pic:nvPicPr>
+                  <pic:blipFill>
+                    <a:blip r:embed="rId10"/>
+                    <a:stretch>
+                      <a:fillRect/>
+                    </a:stretch>
+                  </pic:blipFill>
+                  <pic:spPr>
+                    <a:xfrm>
+                      <a:off x="0" y="0"/>
+                      <a:ext cx="4597636" cy="2044805"/>
+                    </a:xfrm>
+                    <a:prstGeom prst="rect">
+                      <a:avLst/>
+                    </a:prstGeom>
+                  </pic:spPr>
+                </pic:pic>
+              </a:graphicData>
+            </a:graphic>
+          </wp:inline>
+        </w:drawing>
+      </w:r>
+    </w:p>
+    <w:p>
+      <w:pPr>
+        <w:jc w:val="center"/>
+        <w:rPr>
+          <w:rFonts w:ascii="Times New Roman" w:hAnsi="Times New Roman" w:cs="Times New Roman"/>
+        </w:rPr>
+      </w:pPr>
+      <w:r>
+        <w:rPr>
+          <w:rFonts w:ascii="Times New Roman" w:hAnsi="Times New Roman" w:cs="Times New Roman"/>
+        </w:rPr>
+        <w:drawing>
+          <wp:inline distT="0" distB="0" distL="0" distR="0" wp14:anchorId="70C9621C" wp14:editId="56557B2C">
+            <wp:extent cx="4743694" cy="2521080"/>
+            <wp:effectExtent l="0" t="0" r="0" b="0"/>
+            <wp:docPr id="1028339768" name="Kép 1" descr="A képen szöveg, képernyőkép, szoftver, szám látható&#10;&#10;Előfordulhat, hogy az AI által létrehozott tartalom helytelen."/>
+            <wp:cNvGraphicFramePr>
+              <a:graphicFrameLocks xmlns:a="http://schemas.openxmlformats.org/drawingml/2006/main" noChangeAspect="1"/>
+            </wp:cNvGraphicFramePr>
+            <a:graphic xmlns:a="http://schemas.openxmlformats.org/drawingml/2006/main">
+              <a:graphicData uri="http://schemas.openxmlformats.org/drawingml/2006/picture">
+                <pic:pic xmlns:pic="http://schemas.openxmlformats.org/drawingml/2006/picture">
+                  <pic:nvPicPr>
+                    <pic:cNvPr id="1028339768" name="Kép 1" descr="A képen szöveg, képernyőkép, szoftver, szám látható&#10;&#10;Előfordulhat, hogy az AI által létrehozott tartalom helytelen."/>
+                    <pic:cNvPicPr/>
+                  </pic:nvPicPr>
+                  <pic:blipFill>
+                    <a:blip r:embed="rId11"/>
+                    <a:stretch>
+                      <a:fillRect/>
+                    </a:stretch>
+                  </pic:blipFill>
+                  <pic:spPr>
+                    <a:xfrm>
+                      <a:off x="0" y="0"/>
+                      <a:ext cx="4743694" cy="2521080"/>
+                    </a:xfrm>
+                    <a:prstGeom prst="rect">
+                      <a:avLst/>
+                    </a:prstGeom>
+                  </pic:spPr>
+                </pic:pic>
+              </a:graphicData>
+            </a:graphic>
+          </wp:inline>
+        </w:drawing>
+      </w:r>
+    </w:p>
+    <w:p>
+      <w:pPr>
+        <w:jc w:val="center"/>
+        <w:rPr>
+          <w:rFonts w:ascii="Times New Roman" w:hAnsi="Times New Roman" w:cs="Times New Roman"/>
+        </w:rPr>
+      </w:pPr>
+    </w:p>
+    <w:p>
+      <w:pPr>
+        <w:rPr>
+          <w:rFonts w:ascii="Times New Roman" w:hAnsi="Times New Roman" w:cs="Times New Roman"/>
+        </w:rPr>
+      </w:pPr>
+    </w:p>
+    <w:p>
+      <w:pPr>
+        <w:rPr>
+          <w:rFonts w:ascii="Times New Roman" w:hAnsi="Times New Roman" w:cs="Times New Roman"/>
+        </w:rPr>
+      </w:pPr>
+    </w:p>
+    <w:p>
+      <w:pPr>
+        <w:rPr>
+          <w:rFonts w:ascii="Times New Roman" w:hAnsi="Times New Roman" w:cs="Times New Roman"/>
+        </w:rPr>
+      </w:pPr>
+    </w:p>
+    <w:p>
+      <w:pPr>
+        <w:rPr>
+          <w:rFonts w:ascii="Times New Roman" w:hAnsi="Times New Roman" w:cs="Times New Roman"/>
+        </w:rPr>
+      </w:pPr>
+    </w:p>
+    <w:p>
+      <w:pPr>
+        <w:tabs>
+          <w:tab w:val="left" w:pos="1741"/>
+        </w:tabs>
+        <w:rPr>
+          <w:rFonts w:ascii="Times New Roman" w:hAnsi="Times New Roman" w:cs="Times New Roman"/>
+        </w:rPr>
+      </w:pPr>
+      <w:r>
+        <w:rPr>
           <w:noProof/>
         </w:rPr>
-        <w:lastRenderedPageBreak/>
         <mc:AlternateContent>
           <mc:Choice Requires="wps">
             <w:drawing>
@@ -977,6 +1079,7 @@
       </w:r>
       <w:r>
         <w:rPr>
+          <w:noProof/>
           <w:highlight w:val="yellow"/>
         </w:rPr>
         <w:drawing>
@@ -1011,7 +1114,7 @@
                     <pic:cNvPicPr/>
                   </pic:nvPicPr>
                   <pic:blipFill>
-                    <a:blip r:embed="rId7">
+                    <a:blip r:embed="rId12">
                       <a:extLst>
                         <a:ext uri="{28A0092B-C50C-407E-A947-70E740481C1C}">
                           <a14:useLocalDpi xmlns:a14="http://schemas.microsoft.com/office/drawing/2010/main" val="0"/>
@@ -1062,36 +1165,15 @@
         <w:rPr>
           <w:rFonts w:ascii="Times New Roman" w:hAnsi="Times New Roman" w:cs="Times New Roman"/>
         </w:rPr>
-        <w:t xml:space="preserve">z Add </w:t>
-      </w:r>
-      <w:proofErr w:type="spellStart"/>
-      <w:r>
-        <w:rPr>
-          <w:rFonts w:ascii="Times New Roman" w:hAnsi="Times New Roman" w:cs="Times New Roman"/>
-        </w:rPr>
-        <w:t>roles</w:t>
-      </w:r>
-      <w:proofErr w:type="spellEnd"/>
-      <w:r>
-        <w:rPr>
-          <w:rFonts w:ascii="Times New Roman" w:hAnsi="Times New Roman" w:cs="Times New Roman"/>
-        </w:rPr>
-        <w:t xml:space="preserve"> and </w:t>
-      </w:r>
-      <w:proofErr w:type="spellStart"/>
-      <w:r>
-        <w:rPr>
-          <w:rFonts w:ascii="Times New Roman" w:hAnsi="Times New Roman" w:cs="Times New Roman"/>
-        </w:rPr>
-        <w:t>feauter</w:t>
-      </w:r>
-      <w:proofErr w:type="spellEnd"/>
-      <w:r>
-        <w:rPr>
-          <w:rFonts w:ascii="Times New Roman" w:hAnsi="Times New Roman" w:cs="Times New Roman"/>
-        </w:rPr>
-        <w:t xml:space="preserve"> opcióra.</w:t>
-      </w:r>
+        <w:t>z Add roles and feauter opcióra.</w:t>
+      </w:r>
+    </w:p>
+    <w:p>
+      <w:pPr>
+        <w:rPr>
+          <w:rFonts w:ascii="Times New Roman" w:hAnsi="Times New Roman" w:cs="Times New Roman"/>
+        </w:rPr>
+      </w:pPr>
     </w:p>
     <w:p>
       <w:pPr>
@@ -1103,7 +1185,9 @@
       <w:r>
         <w:rPr>
           <w:rFonts w:ascii="Times New Roman" w:hAnsi="Times New Roman" w:cs="Times New Roman"/>
-        </w:rPr>
+          <w:noProof/>
+        </w:rPr>
+        <w:lastRenderedPageBreak/>
         <w:drawing>
           <wp:inline distT="0" distB="0" distL="0" distR="0" wp14:anchorId="22B83276" wp14:editId="67098DA1">
             <wp:extent cx="4978656" cy="3530781"/>
@@ -1120,7 +1204,7 @@
                     <pic:cNvPicPr/>
                   </pic:nvPicPr>
                   <pic:blipFill>
-                    <a:blip r:embed="rId8"/>
+                    <a:blip r:embed="rId13"/>
                     <a:stretch>
                       <a:fillRect/>
                     </a:stretch>
@@ -1148,33 +1232,17 @@
           <w:rFonts w:ascii="Times New Roman" w:hAnsi="Times New Roman" w:cs="Times New Roman"/>
         </w:rPr>
       </w:pPr>
-      <w:proofErr w:type="spellStart"/>
       <w:r>
         <w:rPr>
           <w:rFonts w:ascii="Times New Roman" w:hAnsi="Times New Roman" w:cs="Times New Roman"/>
         </w:rPr>
         <w:t>Role-based</w:t>
       </w:r>
-      <w:proofErr w:type="spellEnd"/>
-      <w:r>
-        <w:rPr>
-          <w:rFonts w:ascii="Times New Roman" w:hAnsi="Times New Roman" w:cs="Times New Roman"/>
-        </w:rPr>
-        <w:t xml:space="preserve"> </w:t>
-      </w:r>
-      <w:proofErr w:type="spellStart"/>
-      <w:r>
-        <w:rPr>
-          <w:rFonts w:ascii="Times New Roman" w:hAnsi="Times New Roman" w:cs="Times New Roman"/>
-        </w:rPr>
-        <w:t>installation</w:t>
-      </w:r>
-      <w:proofErr w:type="spellEnd"/>
-      <w:r>
-        <w:rPr>
-          <w:rFonts w:ascii="Times New Roman" w:hAnsi="Times New Roman" w:cs="Times New Roman"/>
-        </w:rPr>
-        <w:t xml:space="preserve"> kell nekünk: </w:t>
+      <w:r>
+        <w:rPr>
+          <w:rFonts w:ascii="Times New Roman" w:hAnsi="Times New Roman" w:cs="Times New Roman"/>
+        </w:rPr>
+        <w:t xml:space="preserve"> installation kell nekünk: </w:t>
       </w:r>
       <w:r>
         <w:rPr>
@@ -1186,16 +1254,8 @@
         <w:rPr>
           <w:rFonts w:ascii="Times New Roman" w:hAnsi="Times New Roman" w:cs="Times New Roman"/>
         </w:rPr>
-        <w:t xml:space="preserve">pl. Webszerver </w:t>
-      </w:r>
-      <w:proofErr w:type="spellStart"/>
-      <w:r>
-        <w:rPr>
-          <w:rFonts w:ascii="Times New Roman" w:hAnsi="Times New Roman" w:cs="Times New Roman"/>
-        </w:rPr>
-        <w:t>hosting</w:t>
-      </w:r>
-      <w:proofErr w:type="spellEnd"/>
+        <w:t>pl. Webszerver hosting</w:t>
+      </w:r>
     </w:p>
     <w:p>
       <w:pPr>
@@ -1209,7 +1269,6 @@
           <w:rFonts w:ascii="Times New Roman" w:hAnsi="Times New Roman" w:cs="Times New Roman"/>
           <w:noProof/>
         </w:rPr>
-        <w:lastRenderedPageBreak/>
         <mc:AlternateContent>
           <mc:Choice Requires="wps">
             <w:drawing>
@@ -1289,6 +1348,7 @@
       <w:r>
         <w:rPr>
           <w:rFonts w:ascii="Times New Roman" w:hAnsi="Times New Roman" w:cs="Times New Roman"/>
+          <w:noProof/>
         </w:rPr>
         <w:drawing>
           <wp:inline distT="0" distB="0" distL="0" distR="0" wp14:anchorId="7BB32865" wp14:editId="5AAF0714">
@@ -1306,7 +1366,7 @@
                     <pic:cNvPicPr/>
                   </pic:nvPicPr>
                   <pic:blipFill>
-                    <a:blip r:embed="rId9"/>
+                    <a:blip r:embed="rId14"/>
                     <a:stretch>
                       <a:fillRect/>
                     </a:stretch>
@@ -1383,6 +1443,7 @@
           <w:rFonts w:ascii="Times New Roman" w:hAnsi="Times New Roman" w:cs="Times New Roman"/>
           <w:noProof/>
         </w:rPr>
+        <w:lastRenderedPageBreak/>
         <mc:AlternateContent>
           <mc:Choice Requires="wpi">
             <w:drawing>
@@ -1401,7 +1462,7 @@
                 <wp:cNvGraphicFramePr/>
                 <a:graphic xmlns:a="http://schemas.openxmlformats.org/drawingml/2006/main">
                   <a:graphicData uri="http://schemas.microsoft.com/office/word/2010/wordprocessingInk">
-                    <w14:contentPart bwMode="auto" r:id="rId10">
+                    <w14:contentPart bwMode="auto" r:id="rId15">
                       <w14:nvContentPartPr>
                         <w14:cNvContentPartPr/>
                       </w14:nvContentPartPr>
@@ -1437,7 +1498,7 @@
                 <o:lock v:ext="edit" aspectratio="t"/>
               </v:shapetype>
               <v:shape id="Szabadkéz 4" o:spid="_x0000_s1026" type="#_x0000_t75" style="position:absolute;margin-left:130.9pt;margin-top:30.3pt;width:68.5pt;height:20.65pt;z-index:251662336;visibility:visible;mso-wrap-style:square;mso-wrap-distance-left:9pt;mso-wrap-distance-top:0;mso-wrap-distance-right:9pt;mso-wrap-distance-bottom:0;mso-position-horizontal:absolute;mso-position-horizontal-relative:text;mso-position-vertical:absolute;mso-position-vertical-relative:text" o:gfxdata="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">
-                <v:imagedata r:id="rId11" o:title=""/>
+                <v:imagedata r:id="rId16" o:title=""/>
               </v:shape>
             </w:pict>
           </mc:Fallback>
@@ -1466,7 +1527,7 @@
                 <wp:cNvGraphicFramePr/>
                 <a:graphic xmlns:a="http://schemas.openxmlformats.org/drawingml/2006/main">
                   <a:graphicData uri="http://schemas.microsoft.com/office/word/2010/wordprocessingInk">
-                    <w14:contentPart bwMode="auto" r:id="rId12">
+                    <w14:contentPart bwMode="auto" r:id="rId17">
                       <w14:nvContentPartPr>
                         <w14:cNvContentPartPr/>
                       </w14:nvContentPartPr>
@@ -1483,7 +1544,7 @@
           <mc:Fallback>
             <w:pict>
               <v:shape w14:anchorId="5245C1CC" id="Szabadkéz 3" o:spid="_x0000_s1026" type="#_x0000_t75" style="position:absolute;margin-left:247.4pt;margin-top:19.3pt;width:63.35pt;height:18.55pt;z-index:251661312;visibility:visible;mso-wrap-style:square;mso-wrap-distance-left:9pt;mso-wrap-distance-top:0;mso-wrap-distance-right:9pt;mso-wrap-distance-bottom:0;mso-position-horizontal:absolute;mso-position-horizontal-relative:text;mso-position-vertical:absolute;mso-position-vertical-relative:text" o:gfxdata="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">
-                <v:imagedata r:id="rId13" o:title=""/>
+                <v:imagedata r:id="rId18" o:title=""/>
               </v:shape>
             </w:pict>
           </mc:Fallback>
@@ -1492,6 +1553,7 @@
       <w:r>
         <w:rPr>
           <w:rFonts w:ascii="Times New Roman" w:hAnsi="Times New Roman" w:cs="Times New Roman"/>
+          <w:noProof/>
         </w:rPr>
         <w:drawing>
           <wp:inline distT="0" distB="0" distL="0" distR="0" wp14:anchorId="1CDE43F7" wp14:editId="29D33931">
@@ -1509,7 +1571,7 @@
                     <pic:cNvPicPr/>
                   </pic:nvPicPr>
                   <pic:blipFill>
-                    <a:blip r:embed="rId14"/>
+                    <a:blip r:embed="rId19"/>
                     <a:stretch>
                       <a:fillRect/>
                     </a:stretch>
@@ -1536,75 +1598,11 @@
           <w:rFonts w:ascii="Times New Roman" w:hAnsi="Times New Roman" w:cs="Times New Roman"/>
         </w:rPr>
       </w:pPr>
-    </w:p>
-    <w:p>
-      <w:pPr>
-        <w:rPr>
-          <w:rFonts w:ascii="Times New Roman" w:hAnsi="Times New Roman" w:cs="Times New Roman"/>
-        </w:rPr>
-      </w:pPr>
-    </w:p>
-    <w:p>
-      <w:pPr>
-        <w:rPr>
-          <w:rFonts w:ascii="Times New Roman" w:hAnsi="Times New Roman" w:cs="Times New Roman"/>
-        </w:rPr>
-      </w:pPr>
-    </w:p>
-    <w:p>
-      <w:pPr>
-        <w:rPr>
-          <w:rFonts w:ascii="Times New Roman" w:hAnsi="Times New Roman" w:cs="Times New Roman"/>
-        </w:rPr>
-      </w:pPr>
-    </w:p>
-    <w:p>
-      <w:pPr>
-        <w:rPr>
-          <w:rFonts w:ascii="Times New Roman" w:hAnsi="Times New Roman" w:cs="Times New Roman"/>
-        </w:rPr>
-      </w:pPr>
-    </w:p>
-    <w:p>
-      <w:pPr>
-        <w:rPr>
-          <w:rFonts w:ascii="Times New Roman" w:hAnsi="Times New Roman" w:cs="Times New Roman"/>
-        </w:rPr>
-      </w:pPr>
-      <w:r>
-        <w:rPr>
-          <w:rFonts w:ascii="Times New Roman" w:hAnsi="Times New Roman" w:cs="Times New Roman"/>
-        </w:rPr>
-        <w:lastRenderedPageBreak/>
-        <w:t>Kapok egy összegző oldalt az eddig beállított ADDS-</w:t>
-      </w:r>
-      <w:proofErr w:type="spellStart"/>
-      <w:r>
-        <w:rPr>
-          <w:rFonts w:ascii="Times New Roman" w:hAnsi="Times New Roman" w:cs="Times New Roman"/>
-        </w:rPr>
-        <w:t>ről</w:t>
-      </w:r>
-      <w:proofErr w:type="spellEnd"/>
-      <w:r>
-        <w:rPr>
-          <w:rFonts w:ascii="Times New Roman" w:hAnsi="Times New Roman" w:cs="Times New Roman"/>
-        </w:rPr>
-        <w:t xml:space="preserve">, most csak le kell </w:t>
-      </w:r>
-      <w:proofErr w:type="spellStart"/>
-      <w:r>
-        <w:rPr>
-          <w:rFonts w:ascii="Times New Roman" w:hAnsi="Times New Roman" w:cs="Times New Roman"/>
-        </w:rPr>
-        <w:t>okéznom</w:t>
-      </w:r>
-      <w:proofErr w:type="spellEnd"/>
-      <w:r>
-        <w:rPr>
-          <w:rFonts w:ascii="Times New Roman" w:hAnsi="Times New Roman" w:cs="Times New Roman"/>
-        </w:rPr>
-        <w:t xml:space="preserve">, hogy a letöltés kezdetét vegye. </w:t>
+      <w:r>
+        <w:rPr>
+          <w:rFonts w:ascii="Times New Roman" w:hAnsi="Times New Roman" w:cs="Times New Roman"/>
+        </w:rPr>
+        <w:t xml:space="preserve">Kapok egy összegző oldalt az eddig beállított ADDS-ről, most csak le kell okéznom, hogy a letöltés kezdetét vegye. </w:t>
       </w:r>
     </w:p>
     <w:p>
@@ -1617,6 +1615,7 @@
       <w:r>
         <w:rPr>
           <w:rFonts w:ascii="Times New Roman" w:hAnsi="Times New Roman" w:cs="Times New Roman"/>
+          <w:noProof/>
         </w:rPr>
         <w:drawing>
           <wp:inline distT="0" distB="0" distL="0" distR="0" wp14:anchorId="051F15EB" wp14:editId="3D62CD3C">
@@ -1634,7 +1633,7 @@
                     <pic:cNvPicPr/>
                   </pic:nvPicPr>
                   <pic:blipFill>
-                    <a:blip r:embed="rId15"/>
+                    <a:blip r:embed="rId20"/>
                     <a:stretch>
                       <a:fillRect/>
                     </a:stretch>
@@ -1671,21 +1670,7 @@
         <w:rPr>
           <w:rFonts w:ascii="Times New Roman" w:hAnsi="Times New Roman" w:cs="Times New Roman"/>
         </w:rPr>
-        <w:t xml:space="preserve"> (</w:t>
-      </w:r>
-      <w:proofErr w:type="spellStart"/>
-      <w:r>
-        <w:rPr>
-          <w:rFonts w:ascii="Times New Roman" w:hAnsi="Times New Roman" w:cs="Times New Roman"/>
-        </w:rPr>
-        <w:t>forest</w:t>
-      </w:r>
-      <w:proofErr w:type="spellEnd"/>
-      <w:r>
-        <w:rPr>
-          <w:rFonts w:ascii="Times New Roman" w:hAnsi="Times New Roman" w:cs="Times New Roman"/>
-        </w:rPr>
-        <w:t>)</w:t>
+        <w:t xml:space="preserve"> (forest)</w:t>
       </w:r>
       <w:r>
         <w:rPr>
@@ -1699,55 +1684,23 @@
         </w:rPr>
         <w:t xml:space="preserve">. Hozzáadok egy </w:t>
       </w:r>
-      <w:proofErr w:type="spellStart"/>
-      <w:r>
-        <w:rPr>
-          <w:rFonts w:ascii="Times New Roman" w:hAnsi="Times New Roman" w:cs="Times New Roman"/>
-        </w:rPr>
-        <w:t>root</w:t>
-      </w:r>
-      <w:proofErr w:type="spellEnd"/>
-      <w:r>
-        <w:rPr>
-          <w:rFonts w:ascii="Times New Roman" w:hAnsi="Times New Roman" w:cs="Times New Roman"/>
-        </w:rPr>
-        <w:t xml:space="preserve"> </w:t>
-      </w:r>
-      <w:proofErr w:type="spellStart"/>
-      <w:r>
-        <w:rPr>
-          <w:rFonts w:ascii="Times New Roman" w:hAnsi="Times New Roman" w:cs="Times New Roman"/>
-        </w:rPr>
-        <w:t>domaint</w:t>
-      </w:r>
-      <w:proofErr w:type="spellEnd"/>
-      <w:r>
-        <w:rPr>
-          <w:rFonts w:ascii="Times New Roman" w:hAnsi="Times New Roman" w:cs="Times New Roman"/>
-        </w:rPr>
-        <w:t xml:space="preserve">, ami a </w:t>
-      </w:r>
-      <w:proofErr w:type="spellStart"/>
-      <w:proofErr w:type="gramStart"/>
-      <w:r>
-        <w:rPr>
-          <w:rFonts w:ascii="Times New Roman" w:hAnsi="Times New Roman" w:cs="Times New Roman"/>
-        </w:rPr>
-        <w:t>telekom.</w:t>
-      </w:r>
-      <w:r>
-        <w:rPr>
-          <w:rFonts w:ascii="Times New Roman" w:hAnsi="Times New Roman" w:cs="Times New Roman"/>
-        </w:rPr>
-        <w:t>local</w:t>
-      </w:r>
-      <w:proofErr w:type="spellEnd"/>
-      <w:proofErr w:type="gramEnd"/>
-      <w:r>
-        <w:rPr>
-          <w:rFonts w:ascii="Times New Roman" w:hAnsi="Times New Roman" w:cs="Times New Roman"/>
-        </w:rPr>
-        <w:t xml:space="preserve"> </w:t>
+      <w:r>
+        <w:rPr>
+          <w:rFonts w:ascii="Times New Roman" w:hAnsi="Times New Roman" w:cs="Times New Roman"/>
+        </w:rPr>
+        <w:t xml:space="preserve">root </w:t>
+      </w:r>
+      <w:r>
+        <w:rPr>
+          <w:rFonts w:ascii="Times New Roman" w:hAnsi="Times New Roman" w:cs="Times New Roman"/>
+        </w:rPr>
+        <w:t>domaint, ami a telekom.</w:t>
+      </w:r>
+      <w:r>
+        <w:rPr>
+          <w:rFonts w:ascii="Times New Roman" w:hAnsi="Times New Roman" w:cs="Times New Roman"/>
+        </w:rPr>
+        <w:t xml:space="preserve">local </w:t>
       </w:r>
       <w:r>
         <w:rPr>
@@ -1772,7 +1725,9 @@
       <w:r>
         <w:rPr>
           <w:rFonts w:ascii="Times New Roman" w:hAnsi="Times New Roman" w:cs="Times New Roman"/>
-        </w:rPr>
+          <w:noProof/>
+        </w:rPr>
+        <w:lastRenderedPageBreak/>
         <w:drawing>
           <wp:inline distT="0" distB="0" distL="0" distR="0" wp14:anchorId="36AFEAB6" wp14:editId="4074B43A">
             <wp:extent cx="4788146" cy="3562533"/>
@@ -1789,7 +1744,7 @@
                     <pic:cNvPicPr/>
                   </pic:nvPicPr>
                   <pic:blipFill>
-                    <a:blip r:embed="rId16"/>
+                    <a:blip r:embed="rId21"/>
                     <a:stretch>
                       <a:fillRect/>
                     </a:stretch>
@@ -1829,86 +1784,13 @@
         <w:rPr>
           <w:rFonts w:ascii="Times New Roman" w:hAnsi="Times New Roman" w:cs="Times New Roman"/>
         </w:rPr>
-        <w:lastRenderedPageBreak/>
-        <w:t xml:space="preserve">Egy AD-ben több </w:t>
-      </w:r>
-      <w:proofErr w:type="spellStart"/>
-      <w:r>
-        <w:rPr>
-          <w:rFonts w:ascii="Times New Roman" w:hAnsi="Times New Roman" w:cs="Times New Roman"/>
-        </w:rPr>
-        <w:t>domain</w:t>
-      </w:r>
-      <w:proofErr w:type="spellEnd"/>
-      <w:r>
-        <w:rPr>
-          <w:rFonts w:ascii="Times New Roman" w:hAnsi="Times New Roman" w:cs="Times New Roman"/>
-        </w:rPr>
-        <w:t xml:space="preserve"> is lehet, ezeket összeségében hívjuk „</w:t>
-      </w:r>
-      <w:proofErr w:type="spellStart"/>
-      <w:proofErr w:type="gramStart"/>
-      <w:r>
-        <w:rPr>
-          <w:rFonts w:ascii="Times New Roman" w:hAnsi="Times New Roman" w:cs="Times New Roman"/>
-        </w:rPr>
-        <w:t>forest</w:t>
-      </w:r>
-      <w:proofErr w:type="spellEnd"/>
-      <w:r>
-        <w:rPr>
-          <w:rFonts w:ascii="Times New Roman" w:hAnsi="Times New Roman" w:cs="Times New Roman"/>
-        </w:rPr>
-        <w:t>”-</w:t>
-      </w:r>
-      <w:proofErr w:type="spellStart"/>
-      <w:proofErr w:type="gramEnd"/>
-      <w:r>
-        <w:rPr>
-          <w:rFonts w:ascii="Times New Roman" w:hAnsi="Times New Roman" w:cs="Times New Roman"/>
-        </w:rPr>
-        <w:t>nek</w:t>
-      </w:r>
-      <w:proofErr w:type="spellEnd"/>
-      <w:r>
-        <w:rPr>
-          <w:rFonts w:ascii="Times New Roman" w:hAnsi="Times New Roman" w:cs="Times New Roman"/>
-        </w:rPr>
-        <w:t xml:space="preserve">. </w:t>
-      </w:r>
-      <w:r>
-        <w:rPr>
-          <w:rFonts w:ascii="Times New Roman" w:hAnsi="Times New Roman" w:cs="Times New Roman"/>
-        </w:rPr>
-        <w:t xml:space="preserve">A DSRM </w:t>
-      </w:r>
-      <w:proofErr w:type="spellStart"/>
-      <w:r>
-        <w:rPr>
-          <w:rFonts w:ascii="Times New Roman" w:hAnsi="Times New Roman" w:cs="Times New Roman"/>
-        </w:rPr>
-        <w:t>mode-nak</w:t>
-      </w:r>
-      <w:proofErr w:type="spellEnd"/>
-      <w:r>
-        <w:rPr>
-          <w:rFonts w:ascii="Times New Roman" w:hAnsi="Times New Roman" w:cs="Times New Roman"/>
-        </w:rPr>
-        <w:t xml:space="preserve"> állítok </w:t>
-      </w:r>
-      <w:proofErr w:type="spellStart"/>
-      <w:r>
-        <w:rPr>
-          <w:rFonts w:ascii="Times New Roman" w:hAnsi="Times New Roman" w:cs="Times New Roman"/>
-        </w:rPr>
-        <w:t>jeszót</w:t>
-      </w:r>
-      <w:proofErr w:type="spellEnd"/>
-      <w:r>
-        <w:rPr>
-          <w:rFonts w:ascii="Times New Roman" w:hAnsi="Times New Roman" w:cs="Times New Roman"/>
-        </w:rPr>
-        <w:t xml:space="preserve">: ez egy karbantartási </w:t>
+        <w:t xml:space="preserve">Egy AD-ben több domain is lehet, ezeket összeségében hívjuk „forest”-nek. </w:t>
+      </w:r>
+      <w:r>
+        <w:rPr>
+          <w:rFonts w:ascii="Times New Roman" w:hAnsi="Times New Roman" w:cs="Times New Roman"/>
+        </w:rPr>
+        <w:t xml:space="preserve">A DSRM mode-nak állítok jeszót: ez egy karbantartási </w:t>
       </w:r>
       <w:r>
         <w:rPr>
@@ -1927,6 +1809,7 @@
       <w:r>
         <w:rPr>
           <w:rFonts w:ascii="Times New Roman" w:hAnsi="Times New Roman" w:cs="Times New Roman"/>
+          <w:noProof/>
         </w:rPr>
         <w:drawing>
           <wp:inline distT="0" distB="0" distL="0" distR="0" wp14:anchorId="6E6AA8FC" wp14:editId="38128A84">
@@ -1944,7 +1827,7 @@
                     <pic:cNvPicPr/>
                   </pic:nvPicPr>
                   <pic:blipFill>
-                    <a:blip r:embed="rId17"/>
+                    <a:blip r:embed="rId22"/>
                     <a:stretch>
                       <a:fillRect/>
                     </a:stretch>
@@ -1977,66 +1860,36 @@
         </w:rPr>
         <w:t xml:space="preserve">Beállítottam egy </w:t>
       </w:r>
-      <w:proofErr w:type="spellStart"/>
-      <w:r>
-        <w:rPr>
-          <w:rFonts w:ascii="Times New Roman" w:hAnsi="Times New Roman" w:cs="Times New Roman"/>
-        </w:rPr>
-        <w:t>netbios</w:t>
-      </w:r>
-      <w:proofErr w:type="spellEnd"/>
+      <w:r>
+        <w:rPr>
+          <w:rFonts w:ascii="Times New Roman" w:hAnsi="Times New Roman" w:cs="Times New Roman"/>
+        </w:rPr>
+        <w:t xml:space="preserve">netbios </w:t>
+      </w:r>
+      <w:r>
+        <w:rPr>
+          <w:rFonts w:ascii="Times New Roman" w:hAnsi="Times New Roman" w:cs="Times New Roman"/>
+        </w:rPr>
+        <w:t>domain</w:t>
+      </w:r>
+      <w:r>
+        <w:rPr>
+          <w:rFonts w:ascii="Times New Roman" w:hAnsi="Times New Roman" w:cs="Times New Roman"/>
+        </w:rPr>
+        <w:t xml:space="preserve">t. </w:t>
+      </w:r>
+      <w:r>
+        <w:rPr>
+          <w:rFonts w:ascii="Times New Roman" w:hAnsi="Times New Roman" w:cs="Times New Roman"/>
+        </w:rPr>
+        <w:t>A NetBIOS (Network Basic Input/Output System) egy régi, de még ma is előforduló hálózati szolgáltatás, amely lehetővé teszi a számítógépek és alkalmazások közötti kommunikációt helyi hálózatokon.</w:t>
+      </w:r>
       <w:r>
         <w:rPr>
           <w:rFonts w:ascii="Times New Roman" w:hAnsi="Times New Roman" w:cs="Times New Roman"/>
         </w:rPr>
         <w:t xml:space="preserve"> </w:t>
       </w:r>
-      <w:proofErr w:type="spellStart"/>
-      <w:r>
-        <w:rPr>
-          <w:rFonts w:ascii="Times New Roman" w:hAnsi="Times New Roman" w:cs="Times New Roman"/>
-        </w:rPr>
-        <w:t>domain</w:t>
-      </w:r>
-      <w:r>
-        <w:rPr>
-          <w:rFonts w:ascii="Times New Roman" w:hAnsi="Times New Roman" w:cs="Times New Roman"/>
-        </w:rPr>
-        <w:t>t</w:t>
-      </w:r>
-      <w:proofErr w:type="spellEnd"/>
-      <w:r>
-        <w:rPr>
-          <w:rFonts w:ascii="Times New Roman" w:hAnsi="Times New Roman" w:cs="Times New Roman"/>
-        </w:rPr>
-        <w:t xml:space="preserve">. </w:t>
-      </w:r>
-      <w:r>
-        <w:rPr>
-          <w:rFonts w:ascii="Times New Roman" w:hAnsi="Times New Roman" w:cs="Times New Roman"/>
-        </w:rPr>
-        <w:t xml:space="preserve">A </w:t>
-      </w:r>
-      <w:proofErr w:type="spellStart"/>
-      <w:r>
-        <w:rPr>
-          <w:rFonts w:ascii="Times New Roman" w:hAnsi="Times New Roman" w:cs="Times New Roman"/>
-        </w:rPr>
-        <w:t>NetBIOS</w:t>
-      </w:r>
-      <w:proofErr w:type="spellEnd"/>
-      <w:r>
-        <w:rPr>
-          <w:rFonts w:ascii="Times New Roman" w:hAnsi="Times New Roman" w:cs="Times New Roman"/>
-        </w:rPr>
-        <w:t xml:space="preserve"> (Network Basic Input/Output System) egy régi, de még ma is előforduló hálózati szolgáltatás, amely lehetővé teszi a számítógépek és alkalmazások közötti kommunikációt helyi hálózatokon.</w:t>
-      </w:r>
-      <w:r>
-        <w:rPr>
-          <w:rFonts w:ascii="Times New Roman" w:hAnsi="Times New Roman" w:cs="Times New Roman"/>
-        </w:rPr>
-        <w:t xml:space="preserve"> </w:t>
-      </w:r>
     </w:p>
     <w:p>
       <w:pPr>
@@ -2048,7 +1901,9 @@
       <w:r>
         <w:rPr>
           <w:rFonts w:ascii="Times New Roman" w:hAnsi="Times New Roman" w:cs="Times New Roman"/>
-        </w:rPr>
+          <w:noProof/>
+        </w:rPr>
+        <w:lastRenderedPageBreak/>
         <w:drawing>
           <wp:inline distT="0" distB="0" distL="0" distR="0" wp14:anchorId="57820E05" wp14:editId="5D7910B7">
             <wp:extent cx="4807197" cy="3549832"/>
@@ -2065,7 +1920,7 @@
                     <pic:cNvPicPr/>
                   </pic:nvPicPr>
                   <pic:blipFill>
-                    <a:blip r:embed="rId18"/>
+                    <a:blip r:embed="rId23"/>
                     <a:stretch>
                       <a:fillRect/>
                     </a:stretch>
@@ -2105,7 +1960,6 @@
         <w:rPr>
           <w:rFonts w:ascii="Times New Roman" w:hAnsi="Times New Roman" w:cs="Times New Roman"/>
         </w:rPr>
-        <w:lastRenderedPageBreak/>
         <w:t xml:space="preserve">Itt a logfile-ok és adatbázisok elérési útvonalai </w:t>
       </w:r>
       <w:r>
@@ -2149,6 +2003,7 @@
       <w:r>
         <w:rPr>
           <w:rFonts w:ascii="Times New Roman" w:hAnsi="Times New Roman" w:cs="Times New Roman"/>
+          <w:noProof/>
         </w:rPr>
         <w:drawing>
           <wp:inline distT="0" distB="0" distL="0" distR="0" wp14:anchorId="39A024D1" wp14:editId="1ED16455">
@@ -2166,7 +2021,7 @@
                     <pic:cNvPicPr/>
                   </pic:nvPicPr>
                   <pic:blipFill>
-                    <a:blip r:embed="rId19"/>
+                    <a:blip r:embed="rId24"/>
                     <a:stretch>
                       <a:fillRect/>
                     </a:stretch>
@@ -2224,19 +2079,11 @@
         </w:rPr>
         <w:t xml:space="preserve">ezután a tűzfalbeállításokat kell beállítanunk. </w:t>
       </w:r>
-      <w:proofErr w:type="spellStart"/>
-      <w:r>
-        <w:rPr>
-          <w:rFonts w:ascii="Times New Roman" w:hAnsi="Times New Roman" w:cs="Times New Roman"/>
-        </w:rPr>
-        <w:t>DDoS</w:t>
-      </w:r>
-      <w:proofErr w:type="spellEnd"/>
-      <w:r>
-        <w:rPr>
-          <w:rFonts w:ascii="Times New Roman" w:hAnsi="Times New Roman" w:cs="Times New Roman"/>
-        </w:rPr>
-        <w:t xml:space="preserve"> támadásokra most megnyit</w:t>
+      <w:r>
+        <w:rPr>
+          <w:rFonts w:ascii="Times New Roman" w:hAnsi="Times New Roman" w:cs="Times New Roman"/>
+        </w:rPr>
+        <w:t>DDoS támadásokra most megnyit</w:t>
       </w:r>
       <w:r>
         <w:rPr>
@@ -2248,16 +2095,8 @@
         <w:rPr>
           <w:rFonts w:ascii="Times New Roman" w:hAnsi="Times New Roman" w:cs="Times New Roman"/>
         </w:rPr>
-        <w:t xml:space="preserve">tunk telepítés során minden </w:t>
-      </w:r>
-      <w:proofErr w:type="spellStart"/>
-      <w:r>
-        <w:rPr>
-          <w:rFonts w:ascii="Times New Roman" w:hAnsi="Times New Roman" w:cs="Times New Roman"/>
-        </w:rPr>
-        <w:t>portot</w:t>
-      </w:r>
-      <w:proofErr w:type="spellEnd"/>
+        <w:t>tunk telepítés során minden portot</w:t>
+      </w:r>
       <w:r>
         <w:rPr>
           <w:rFonts w:ascii="Times New Roman" w:hAnsi="Times New Roman" w:cs="Times New Roman"/>
@@ -2274,27 +2113,20 @@
         <w:rPr>
           <w:rFonts w:ascii="Times New Roman" w:hAnsi="Times New Roman" w:cs="Times New Roman"/>
         </w:rPr>
-        <w:t xml:space="preserve">zolgáltatást tudjuk elérni. Ezt korlátozni kell nehogy hozzáférjenek illetéktelen felhasználók a </w:t>
-      </w:r>
-      <w:r>
-        <w:rPr>
-          <w:rFonts w:ascii="Times New Roman" w:hAnsi="Times New Roman" w:cs="Times New Roman"/>
-        </w:rPr>
-        <w:t>policyk-</w:t>
-      </w:r>
-      <w:proofErr w:type="spellStart"/>
-      <w:r>
-        <w:rPr>
-          <w:rFonts w:ascii="Times New Roman" w:hAnsi="Times New Roman" w:cs="Times New Roman"/>
-        </w:rPr>
-        <w:t>hez</w:t>
-      </w:r>
-      <w:proofErr w:type="spellEnd"/>
-      <w:r>
-        <w:rPr>
-          <w:rFonts w:ascii="Times New Roman" w:hAnsi="Times New Roman" w:cs="Times New Roman"/>
-        </w:rPr>
-        <w:t xml:space="preserve"> és felhasználói adatokhoz</w:t>
+        <w:t xml:space="preserve">zolgáltatást </w:t>
+      </w:r>
+      <w:r>
+        <w:rPr>
+          <w:rFonts w:ascii="Times New Roman" w:hAnsi="Times New Roman" w:cs="Times New Roman"/>
+        </w:rPr>
+        <w:lastRenderedPageBreak/>
+        <w:t xml:space="preserve">tudjuk elérni. Ezt korlátozni kell nehogy hozzáférjenek illetéktelen felhasználók a </w:t>
+      </w:r>
+      <w:r>
+        <w:rPr>
+          <w:rFonts w:ascii="Times New Roman" w:hAnsi="Times New Roman" w:cs="Times New Roman"/>
+        </w:rPr>
+        <w:t>policyk-hez és felhasználói adatokhoz</w:t>
       </w:r>
       <w:r>
         <w:rPr>
@@ -2306,35 +2138,7 @@
         <w:rPr>
           <w:rFonts w:ascii="Times New Roman" w:hAnsi="Times New Roman" w:cs="Times New Roman"/>
         </w:rPr>
-        <w:t xml:space="preserve">Itt látható a sok </w:t>
-      </w:r>
-      <w:proofErr w:type="spellStart"/>
-      <w:r>
-        <w:rPr>
-          <w:rFonts w:ascii="Times New Roman" w:hAnsi="Times New Roman" w:cs="Times New Roman"/>
-        </w:rPr>
-        <w:t>inbound</w:t>
-      </w:r>
-      <w:proofErr w:type="spellEnd"/>
-      <w:r>
-        <w:rPr>
-          <w:rFonts w:ascii="Times New Roman" w:hAnsi="Times New Roman" w:cs="Times New Roman"/>
-        </w:rPr>
-        <w:t xml:space="preserve"> </w:t>
-      </w:r>
-      <w:proofErr w:type="spellStart"/>
-      <w:r>
-        <w:rPr>
-          <w:rFonts w:ascii="Times New Roman" w:hAnsi="Times New Roman" w:cs="Times New Roman"/>
-        </w:rPr>
-        <w:t>rule</w:t>
-      </w:r>
-      <w:proofErr w:type="spellEnd"/>
-      <w:r>
-        <w:rPr>
-          <w:rFonts w:ascii="Times New Roman" w:hAnsi="Times New Roman" w:cs="Times New Roman"/>
-        </w:rPr>
-        <w:t>:</w:t>
+        <w:t>Itt látható a sok inbound rule:</w:t>
       </w:r>
     </w:p>
     <w:p>
@@ -2347,6 +2151,7 @@
       <w:r>
         <w:rPr>
           <w:rFonts w:ascii="Times New Roman" w:hAnsi="Times New Roman" w:cs="Times New Roman"/>
+          <w:noProof/>
         </w:rPr>
         <w:drawing>
           <wp:inline distT="0" distB="0" distL="0" distR="0" wp14:anchorId="4178BB6E" wp14:editId="7BF58C60">
@@ -2364,7 +2169,7 @@
                     <pic:cNvPicPr/>
                   </pic:nvPicPr>
                   <pic:blipFill>
-                    <a:blip r:embed="rId20"/>
+                    <a:blip r:embed="rId25"/>
                     <a:stretch>
                       <a:fillRect/>
                     </a:stretch>
@@ -2387,39 +2192,6 @@
     </w:p>
     <w:p>
       <w:pPr>
-        <w:rPr>
-          <w:rFonts w:ascii="Times New Roman" w:hAnsi="Times New Roman" w:cs="Times New Roman"/>
-        </w:rPr>
-      </w:pPr>
-    </w:p>
-    <w:p>
-      <w:pPr>
-        <w:tabs>
-          <w:tab w:val="left" w:pos="3844"/>
-        </w:tabs>
-        <w:rPr>
-          <w:rFonts w:ascii="Times New Roman" w:hAnsi="Times New Roman" w:cs="Times New Roman"/>
-        </w:rPr>
-      </w:pPr>
-      <w:r>
-        <w:rPr>
-          <w:rFonts w:ascii="Times New Roman" w:hAnsi="Times New Roman" w:cs="Times New Roman"/>
-        </w:rPr>
-        <w:tab/>
-      </w:r>
-    </w:p>
-    <w:p>
-      <w:pPr>
-        <w:tabs>
-          <w:tab w:val="left" w:pos="3844"/>
-        </w:tabs>
-        <w:rPr>
-          <w:rFonts w:ascii="Times New Roman" w:hAnsi="Times New Roman" w:cs="Times New Roman"/>
-        </w:rPr>
-      </w:pPr>
-    </w:p>
-    <w:p>
-      <w:pPr>
         <w:tabs>
           <w:tab w:val="left" w:pos="3844"/>
         </w:tabs>
@@ -2432,56 +2204,13 @@
         <w:rPr>
           <w:rFonts w:ascii="Times New Roman" w:hAnsi="Times New Roman" w:cs="Times New Roman"/>
         </w:rPr>
-        <w:lastRenderedPageBreak/>
-        <w:t xml:space="preserve">Az </w:t>
-      </w:r>
-      <w:proofErr w:type="spellStart"/>
-      <w:r>
-        <w:rPr>
-          <w:rFonts w:ascii="Times New Roman" w:hAnsi="Times New Roman" w:cs="Times New Roman"/>
-        </w:rPr>
-        <w:t>inbound</w:t>
-      </w:r>
-      <w:proofErr w:type="spellEnd"/>
-      <w:r>
-        <w:rPr>
-          <w:rFonts w:ascii="Times New Roman" w:hAnsi="Times New Roman" w:cs="Times New Roman"/>
-        </w:rPr>
-        <w:t xml:space="preserve"> </w:t>
-      </w:r>
-      <w:proofErr w:type="spellStart"/>
-      <w:r>
-        <w:rPr>
-          <w:rFonts w:ascii="Times New Roman" w:hAnsi="Times New Roman" w:cs="Times New Roman"/>
-        </w:rPr>
-        <w:t>rule</w:t>
-      </w:r>
-      <w:proofErr w:type="spellEnd"/>
-      <w:r>
-        <w:rPr>
-          <w:rFonts w:ascii="Times New Roman" w:hAnsi="Times New Roman" w:cs="Times New Roman"/>
-        </w:rPr>
-        <w:t xml:space="preserve">-ok között megkerestem az LDAP </w:t>
-      </w:r>
-      <w:r>
-        <w:rPr>
-          <w:rFonts w:ascii="Times New Roman" w:hAnsi="Times New Roman" w:cs="Times New Roman"/>
-        </w:rPr>
-        <w:t xml:space="preserve">UDP szabályát. Itt a </w:t>
-      </w:r>
-      <w:proofErr w:type="spellStart"/>
-      <w:r>
-        <w:rPr>
-          <w:rFonts w:ascii="Times New Roman" w:hAnsi="Times New Roman" w:cs="Times New Roman"/>
-        </w:rPr>
-        <w:t>scope</w:t>
-      </w:r>
-      <w:proofErr w:type="spellEnd"/>
-      <w:r>
-        <w:rPr>
-          <w:rFonts w:ascii="Times New Roman" w:hAnsi="Times New Roman" w:cs="Times New Roman"/>
-        </w:rPr>
-        <w:t xml:space="preserve"> fülben megadom, hogy melyik tartományok szerepeljenek benne</w:t>
+        <w:t xml:space="preserve">Az inbound rule-ok között megkerestem az LDAP </w:t>
+      </w:r>
+      <w:r>
+        <w:rPr>
+          <w:rFonts w:ascii="Times New Roman" w:hAnsi="Times New Roman" w:cs="Times New Roman"/>
+        </w:rPr>
+        <w:t>UDP szabályát. Itt a scope fülben megadom, hogy melyik tartományok szerepeljenek benne</w:t>
       </w:r>
       <w:r>
         <w:rPr>
@@ -2493,83 +2222,13 @@
         <w:rPr>
           <w:rFonts w:ascii="Times New Roman" w:hAnsi="Times New Roman" w:cs="Times New Roman"/>
         </w:rPr>
-        <w:t xml:space="preserve">áférést a saját </w:t>
-      </w:r>
-      <w:proofErr w:type="spellStart"/>
-      <w:r>
-        <w:rPr>
-          <w:rFonts w:ascii="Times New Roman" w:hAnsi="Times New Roman" w:cs="Times New Roman"/>
-        </w:rPr>
-        <w:t>lanjára</w:t>
-      </w:r>
-      <w:proofErr w:type="spellEnd"/>
-      <w:r>
-        <w:rPr>
-          <w:rFonts w:ascii="Times New Roman" w:hAnsi="Times New Roman" w:cs="Times New Roman"/>
-        </w:rPr>
-        <w:t xml:space="preserve"> a szervernek. Később persze majd hozzáadjuk a többi telephely </w:t>
-      </w:r>
-      <w:proofErr w:type="spellStart"/>
-      <w:r>
-        <w:rPr>
-          <w:rFonts w:ascii="Times New Roman" w:hAnsi="Times New Roman" w:cs="Times New Roman"/>
-        </w:rPr>
-        <w:t>lanjait</w:t>
-      </w:r>
-      <w:proofErr w:type="spellEnd"/>
-      <w:r>
-        <w:rPr>
-          <w:rFonts w:ascii="Times New Roman" w:hAnsi="Times New Roman" w:cs="Times New Roman"/>
-        </w:rPr>
-        <w:t xml:space="preserve"> és VLAN-</w:t>
-      </w:r>
-      <w:proofErr w:type="spellStart"/>
-      <w:r>
-        <w:rPr>
-          <w:rFonts w:ascii="Times New Roman" w:hAnsi="Times New Roman" w:cs="Times New Roman"/>
-        </w:rPr>
-        <w:t>jait</w:t>
-      </w:r>
-      <w:proofErr w:type="spellEnd"/>
-      <w:r>
-        <w:rPr>
-          <w:rFonts w:ascii="Times New Roman" w:hAnsi="Times New Roman" w:cs="Times New Roman"/>
-        </w:rPr>
-        <w:t xml:space="preserve"> is amennyiben szükséges. </w:t>
-      </w:r>
-      <w:r>
-        <w:rPr>
-          <w:rFonts w:ascii="Times New Roman" w:hAnsi="Times New Roman" w:cs="Times New Roman"/>
-        </w:rPr>
-        <w:t xml:space="preserve">Mostantól bejelentkezéshez a </w:t>
-      </w:r>
-      <w:proofErr w:type="spellStart"/>
-      <w:r>
-        <w:rPr>
-          <w:rFonts w:ascii="Times New Roman" w:hAnsi="Times New Roman" w:cs="Times New Roman"/>
-        </w:rPr>
-        <w:t>netbios</w:t>
-      </w:r>
-      <w:proofErr w:type="spellEnd"/>
-      <w:r>
-        <w:rPr>
-          <w:rFonts w:ascii="Times New Roman" w:hAnsi="Times New Roman" w:cs="Times New Roman"/>
-        </w:rPr>
-        <w:t xml:space="preserve"> </w:t>
-      </w:r>
-      <w:proofErr w:type="spellStart"/>
-      <w:r>
-        <w:rPr>
-          <w:rFonts w:ascii="Times New Roman" w:hAnsi="Times New Roman" w:cs="Times New Roman"/>
-        </w:rPr>
-        <w:t>domain</w:t>
-      </w:r>
-      <w:proofErr w:type="spellEnd"/>
-      <w:r>
-        <w:rPr>
-          <w:rFonts w:ascii="Times New Roman" w:hAnsi="Times New Roman" w:cs="Times New Roman"/>
-        </w:rPr>
-        <w:t xml:space="preserve"> nevet alkalmazom, amikor bejelentkezek. </w:t>
+        <w:t xml:space="preserve">áférést a saját lanjára a szervernek. Később persze majd hozzáadjuk a többi telephely lanjait és VLAN-jait is amennyiben szükséges. </w:t>
+      </w:r>
+      <w:r>
+        <w:rPr>
+          <w:rFonts w:ascii="Times New Roman" w:hAnsi="Times New Roman" w:cs="Times New Roman"/>
+        </w:rPr>
+        <w:t xml:space="preserve">Mostantól bejelentkezéshez a netbios domain nevet alkalmazom, amikor bejelentkezek. </w:t>
       </w:r>
     </w:p>
     <w:p>
@@ -2585,9 +2244,10 @@
       <w:r>
         <w:rPr>
           <w:rFonts w:ascii="Times New Roman" w:hAnsi="Times New Roman" w:cs="Times New Roman"/>
+          <w:noProof/>
         </w:rPr>
         <w:drawing>
-          <wp:inline distT="0" distB="0" distL="0" distR="0" wp14:anchorId="362C71E5" wp14:editId="390BF45F">
+          <wp:inline distT="0" distB="0" distL="0" distR="0" wp14:anchorId="362C71E5" wp14:editId="415C38FC">
             <wp:extent cx="2743341" cy="3676839"/>
             <wp:effectExtent l="0" t="0" r="0" b="0"/>
             <wp:docPr id="1509933048" name="Kép 1" descr="A képen szöveg, képernyőkép, képernyő, szoftver látható&#10;&#10;Előfordulhat, hogy az AI által létrehozott tartalom helytelen."/>
@@ -2602,7 +2262,7 @@
                     <pic:cNvPicPr/>
                   </pic:nvPicPr>
                   <pic:blipFill>
-                    <a:blip r:embed="rId21"/>
+                    <a:blip r:embed="rId26"/>
                     <a:stretch>
                       <a:fillRect/>
                     </a:stretch>
@@ -2629,6 +2289,13 @@
           <w:rFonts w:ascii="Times New Roman" w:hAnsi="Times New Roman" w:cs="Times New Roman"/>
         </w:rPr>
       </w:pPr>
+    </w:p>
+    <w:p>
+      <w:pPr>
+        <w:rPr>
+          <w:rFonts w:ascii="Times New Roman" w:hAnsi="Times New Roman" w:cs="Times New Roman"/>
+        </w:rPr>
+      </w:pPr>
       <w:r>
         <w:rPr>
           <w:rFonts w:ascii="Times New Roman" w:hAnsi="Times New Roman" w:cs="Times New Roman"/>
@@ -2641,14 +2308,12 @@
         </w:rPr>
         <w:t>„</w:t>
       </w:r>
-      <w:proofErr w:type="spellStart"/>
       <w:r>
         <w:rPr>
           <w:rFonts w:ascii="Times New Roman" w:hAnsi="Times New Roman" w:cs="Times New Roman"/>
         </w:rPr>
         <w:t>Get-ADDomainController</w:t>
       </w:r>
-      <w:proofErr w:type="spellEnd"/>
       <w:r>
         <w:rPr>
           <w:rFonts w:ascii="Times New Roman" w:hAnsi="Times New Roman" w:cs="Times New Roman"/>
@@ -2663,15 +2328,24 @@
           <w:rFonts w:ascii="Times New Roman" w:hAnsi="Times New Roman" w:cs="Times New Roman"/>
         </w:rPr>
       </w:pPr>
-      <w:r>
-        <w:rPr>
-          <w:rFonts w:ascii="Times New Roman" w:hAnsi="Times New Roman" w:cs="Times New Roman"/>
-        </w:rPr>
+    </w:p>
+    <w:p>
+      <w:pPr>
+        <w:jc w:val="center"/>
+        <w:rPr>
+          <w:rFonts w:ascii="Times New Roman" w:hAnsi="Times New Roman" w:cs="Times New Roman"/>
+        </w:rPr>
+      </w:pPr>
+      <w:r>
+        <w:rPr>
+          <w:rFonts w:ascii="Times New Roman" w:hAnsi="Times New Roman" w:cs="Times New Roman"/>
+        </w:rPr>
+        <w:lastRenderedPageBreak/>
         <w:drawing>
-          <wp:inline distT="0" distB="0" distL="0" distR="0" wp14:anchorId="750DB6E0" wp14:editId="7184EDAC">
-            <wp:extent cx="5760720" cy="2671445"/>
-            <wp:effectExtent l="0" t="0" r="0" b="0"/>
-            <wp:docPr id="1852331851" name="Kép 1" descr="A képen szöveg, képernyőkép, Betűtípus látható&#10;&#10;Előfordulhat, hogy az AI által létrehozott tartalom helytelen."/>
+          <wp:inline distT="0" distB="0" distL="0" distR="0" wp14:anchorId="34AF339B" wp14:editId="77BDD14B">
+            <wp:extent cx="5760720" cy="3103880"/>
+            <wp:effectExtent l="0" t="0" r="0" b="1270"/>
+            <wp:docPr id="783045044" name="Kép 1" descr="A képen szöveg, képernyőkép, szoftver, Webhely látható&#10;&#10;Előfordulhat, hogy az AI által létrehozott tartalom helytelen."/>
             <wp:cNvGraphicFramePr>
               <a:graphicFrameLocks xmlns:a="http://schemas.openxmlformats.org/drawingml/2006/main" noChangeAspect="1"/>
             </wp:cNvGraphicFramePr>
@@ -2679,11 +2353,11 @@
               <a:graphicData uri="http://schemas.openxmlformats.org/drawingml/2006/picture">
                 <pic:pic xmlns:pic="http://schemas.openxmlformats.org/drawingml/2006/picture">
                   <pic:nvPicPr>
-                    <pic:cNvPr id="1852331851" name="Kép 1" descr="A képen szöveg, képernyőkép, Betűtípus látható&#10;&#10;Előfordulhat, hogy az AI által létrehozott tartalom helytelen."/>
+                    <pic:cNvPr id="783045044" name="Kép 1" descr="A képen szöveg, képernyőkép, szoftver, Webhely látható&#10;&#10;Előfordulhat, hogy az AI által létrehozott tartalom helytelen."/>
                     <pic:cNvPicPr/>
                   </pic:nvPicPr>
                   <pic:blipFill>
-                    <a:blip r:embed="rId22"/>
+                    <a:blip r:embed="rId27"/>
                     <a:stretch>
                       <a:fillRect/>
                     </a:stretch>
@@ -2691,7 +2365,7 @@
                   <pic:spPr>
                     <a:xfrm>
                       <a:off x="0" y="0"/>
-                      <a:ext cx="5760720" cy="2671445"/>
+                      <a:ext cx="5760720" cy="3103880"/>
                     </a:xfrm>
                     <a:prstGeom prst="rect">
                       <a:avLst/>
@@ -2710,9 +2384,857 @@
           <w:rFonts w:ascii="Times New Roman" w:hAnsi="Times New Roman" w:cs="Times New Roman"/>
         </w:rPr>
       </w:pPr>
+      <w:r>
+        <w:rPr>
+          <w:rFonts w:ascii="Times New Roman" w:hAnsi="Times New Roman" w:cs="Times New Roman"/>
+          <w:highlight w:val="cyan"/>
+        </w:rPr>
+        <w:t>Konfiguráció:</w:t>
+      </w:r>
+      <w:r>
+        <w:rPr>
+          <w:rFonts w:ascii="Times New Roman" w:hAnsi="Times New Roman" w:cs="Times New Roman"/>
+        </w:rPr>
+        <w:t xml:space="preserve"> </w:t>
+      </w:r>
+    </w:p>
+    <w:p>
+      <w:pPr>
+        <w:rPr>
+          <w:rFonts w:ascii="Times New Roman" w:hAnsi="Times New Roman" w:cs="Times New Roman"/>
+        </w:rPr>
+      </w:pPr>
+      <w:r>
+        <w:rPr>
+          <w:rFonts w:ascii="Times New Roman" w:hAnsi="Times New Roman" w:cs="Times New Roman"/>
+        </w:rPr>
+        <w:t xml:space="preserve">Most pedig, hogy az ADDS megvan kiválasztom a roles and feauteresbe ugyanott, ugyanúgy role-based featureként a DHCP szerverszolgáltatást. </w:t>
+      </w:r>
+    </w:p>
+    <w:p>
+      <w:pPr>
+        <w:jc w:val="center"/>
+        <w:rPr>
+          <w:rFonts w:ascii="Times New Roman" w:hAnsi="Times New Roman" w:cs="Times New Roman"/>
+        </w:rPr>
+      </w:pPr>
+      <w:r>
+        <w:rPr>
+          <w:rFonts w:ascii="Times New Roman" w:hAnsi="Times New Roman" w:cs="Times New Roman"/>
+        </w:rPr>
+        <w:drawing>
+          <wp:inline distT="0" distB="0" distL="0" distR="0" wp14:anchorId="1D7DC4E5" wp14:editId="6449D203">
+            <wp:extent cx="4959605" cy="3543482"/>
+            <wp:effectExtent l="0" t="0" r="0" b="0"/>
+            <wp:docPr id="353956958" name="Kép 1" descr="A képen szöveg, képernyőkép, szoftver, Weblap látható&#10;&#10;Előfordulhat, hogy az AI által létrehozott tartalom helytelen."/>
+            <wp:cNvGraphicFramePr>
+              <a:graphicFrameLocks xmlns:a="http://schemas.openxmlformats.org/drawingml/2006/main" noChangeAspect="1"/>
+            </wp:cNvGraphicFramePr>
+            <a:graphic xmlns:a="http://schemas.openxmlformats.org/drawingml/2006/main">
+              <a:graphicData uri="http://schemas.openxmlformats.org/drawingml/2006/picture">
+                <pic:pic xmlns:pic="http://schemas.openxmlformats.org/drawingml/2006/picture">
+                  <pic:nvPicPr>
+                    <pic:cNvPr id="353956958" name="Kép 1" descr="A képen szöveg, képernyőkép, szoftver, Weblap látható&#10;&#10;Előfordulhat, hogy az AI által létrehozott tartalom helytelen."/>
+                    <pic:cNvPicPr/>
+                  </pic:nvPicPr>
+                  <pic:blipFill>
+                    <a:blip r:embed="rId28"/>
+                    <a:stretch>
+                      <a:fillRect/>
+                    </a:stretch>
+                  </pic:blipFill>
+                  <pic:spPr>
+                    <a:xfrm>
+                      <a:off x="0" y="0"/>
+                      <a:ext cx="4959605" cy="3543482"/>
+                    </a:xfrm>
+                    <a:prstGeom prst="rect">
+                      <a:avLst/>
+                    </a:prstGeom>
+                  </pic:spPr>
+                </pic:pic>
+              </a:graphicData>
+            </a:graphic>
+          </wp:inline>
+        </w:drawing>
+      </w:r>
+    </w:p>
+    <w:p>
+      <w:pPr>
+        <w:jc w:val="center"/>
+        <w:rPr>
+          <w:rFonts w:ascii="Times New Roman" w:hAnsi="Times New Roman" w:cs="Times New Roman"/>
+        </w:rPr>
+      </w:pPr>
+      <w:r>
+        <w:rPr>
+          <w:rFonts w:ascii="Times New Roman" w:hAnsi="Times New Roman" w:cs="Times New Roman"/>
+        </w:rPr>
+        <w:lastRenderedPageBreak/>
+        <w:drawing>
+          <wp:inline distT="0" distB="0" distL="0" distR="0" wp14:anchorId="0E2E06C6" wp14:editId="5BC0EE37">
+            <wp:extent cx="4940554" cy="3505380"/>
+            <wp:effectExtent l="0" t="0" r="0" b="0"/>
+            <wp:docPr id="315652023" name="Kép 1" descr="A képen szöveg, képernyőkép, szoftver, Weblap látható&#10;&#10;Előfordulhat, hogy az AI által létrehozott tartalom helytelen."/>
+            <wp:cNvGraphicFramePr>
+              <a:graphicFrameLocks xmlns:a="http://schemas.openxmlformats.org/drawingml/2006/main" noChangeAspect="1"/>
+            </wp:cNvGraphicFramePr>
+            <a:graphic xmlns:a="http://schemas.openxmlformats.org/drawingml/2006/main">
+              <a:graphicData uri="http://schemas.openxmlformats.org/drawingml/2006/picture">
+                <pic:pic xmlns:pic="http://schemas.openxmlformats.org/drawingml/2006/picture">
+                  <pic:nvPicPr>
+                    <pic:cNvPr id="315652023" name="Kép 1" descr="A képen szöveg, képernyőkép, szoftver, Weblap látható&#10;&#10;Előfordulhat, hogy az AI által létrehozott tartalom helytelen."/>
+                    <pic:cNvPicPr/>
+                  </pic:nvPicPr>
+                  <pic:blipFill>
+                    <a:blip r:embed="rId29"/>
+                    <a:stretch>
+                      <a:fillRect/>
+                    </a:stretch>
+                  </pic:blipFill>
+                  <pic:spPr>
+                    <a:xfrm>
+                      <a:off x="0" y="0"/>
+                      <a:ext cx="4940554" cy="3505380"/>
+                    </a:xfrm>
+                    <a:prstGeom prst="rect">
+                      <a:avLst/>
+                    </a:prstGeom>
+                  </pic:spPr>
+                </pic:pic>
+              </a:graphicData>
+            </a:graphic>
+          </wp:inline>
+        </w:drawing>
+      </w:r>
+    </w:p>
+    <w:p>
+      <w:pPr>
+        <w:rPr>
+          <w:rFonts w:ascii="Times New Roman" w:hAnsi="Times New Roman" w:cs="Times New Roman"/>
+        </w:rPr>
+      </w:pPr>
+      <w:r>
+        <w:rPr>
+          <w:rFonts w:ascii="Times New Roman" w:hAnsi="Times New Roman" w:cs="Times New Roman"/>
+        </w:rPr>
+        <w:t>Miután letöltött a DHCP szerverszolgáltatás utána</w:t>
+      </w:r>
+      <w:r>
+        <w:rPr>
+          <w:rFonts w:ascii="Times New Roman" w:hAnsi="Times New Roman" w:cs="Times New Roman"/>
+        </w:rPr>
+        <w:t xml:space="preserve">: </w:t>
+      </w:r>
+      <w:r>
+        <w:rPr>
+          <w:rFonts w:ascii="Times New Roman" w:hAnsi="Times New Roman" w:cs="Times New Roman"/>
+        </w:rPr>
+        <w:t xml:space="preserve">látszik, hogy két alapértelmezett </w:t>
+      </w:r>
+      <w:r>
+        <w:rPr>
+          <w:rFonts w:ascii="Times New Roman" w:hAnsi="Times New Roman" w:cs="Times New Roman"/>
+        </w:rPr>
+        <w:t xml:space="preserve">Security Group van: </w:t>
+      </w:r>
+      <w:r>
+        <w:rPr>
+          <w:rFonts w:ascii="Times New Roman" w:hAnsi="Times New Roman" w:cs="Times New Roman"/>
+        </w:rPr>
+        <w:t>„</w:t>
+      </w:r>
+      <w:r>
+        <w:rPr>
+          <w:rFonts w:ascii="Times New Roman" w:hAnsi="Times New Roman" w:cs="Times New Roman"/>
+          <w:b/>
+          <w:bCs/>
+          <w:i/>
+          <w:iCs/>
+        </w:rPr>
+        <w:t>DHCP Administrators</w:t>
+      </w:r>
+      <w:r>
+        <w:rPr>
+          <w:rFonts w:ascii="Times New Roman" w:hAnsi="Times New Roman" w:cs="Times New Roman"/>
+          <w:b/>
+          <w:bCs/>
+          <w:i/>
+          <w:iCs/>
+        </w:rPr>
+        <w:t>”</w:t>
+      </w:r>
+      <w:r>
+        <w:rPr>
+          <w:rFonts w:ascii="Times New Roman" w:hAnsi="Times New Roman" w:cs="Times New Roman"/>
+        </w:rPr>
+        <w:t xml:space="preserve"> és </w:t>
+      </w:r>
+      <w:r>
+        <w:rPr>
+          <w:rFonts w:ascii="Times New Roman" w:hAnsi="Times New Roman" w:cs="Times New Roman"/>
+        </w:rPr>
+        <w:t>„</w:t>
+      </w:r>
+      <w:r>
+        <w:rPr>
+          <w:rFonts w:ascii="Times New Roman" w:hAnsi="Times New Roman" w:cs="Times New Roman"/>
+          <w:b/>
+          <w:bCs/>
+          <w:i/>
+          <w:iCs/>
+        </w:rPr>
+        <w:t>DHCP Users</w:t>
+      </w:r>
+      <w:r>
+        <w:rPr>
+          <w:rFonts w:ascii="Times New Roman" w:hAnsi="Times New Roman" w:cs="Times New Roman"/>
+          <w:b/>
+          <w:bCs/>
+          <w:i/>
+          <w:iCs/>
+        </w:rPr>
+        <w:t>”</w:t>
+      </w:r>
+      <w:r>
+        <w:rPr>
+          <w:rFonts w:ascii="Times New Roman" w:hAnsi="Times New Roman" w:cs="Times New Roman"/>
+          <w:b/>
+          <w:bCs/>
+          <w:i/>
+          <w:iCs/>
+        </w:rPr>
+        <w:t xml:space="preserve">. </w:t>
+      </w:r>
+      <w:r>
+        <w:rPr>
+          <w:rFonts w:ascii="Times New Roman" w:hAnsi="Times New Roman" w:cs="Times New Roman"/>
+        </w:rPr>
+        <w:t xml:space="preserve">Az adminoknak full joguk van a DHCP szerverhez, a felhasználóknak, pedig </w:t>
+      </w:r>
+      <w:r>
+        <w:rPr>
+          <w:rFonts w:ascii="Times New Roman" w:hAnsi="Times New Roman" w:cs="Times New Roman"/>
+        </w:rPr>
+        <w:t xml:space="preserve">csak megtekintési joguk van. </w:t>
+      </w:r>
+    </w:p>
+    <w:p>
+      <w:pPr>
+        <w:jc w:val="center"/>
+        <w:rPr>
+          <w:rFonts w:ascii="Times New Roman" w:hAnsi="Times New Roman" w:cs="Times New Roman"/>
+        </w:rPr>
+      </w:pPr>
+      <w:r>
+        <w:rPr>
+          <w:rFonts w:ascii="Times New Roman" w:hAnsi="Times New Roman" w:cs="Times New Roman"/>
+        </w:rPr>
+        <w:drawing>
+          <wp:inline distT="0" distB="0" distL="0" distR="0" wp14:anchorId="308B32C7" wp14:editId="7F0C5F7C">
+            <wp:extent cx="3587934" cy="2578233"/>
+            <wp:effectExtent l="0" t="0" r="0" b="0"/>
+            <wp:docPr id="1757553420" name="Kép 1" descr="A képen szöveg, elektronika, képernyőkép, Betűtípus látható&#10;&#10;Előfordulhat, hogy az AI által létrehozott tartalom helytelen."/>
+            <wp:cNvGraphicFramePr>
+              <a:graphicFrameLocks xmlns:a="http://schemas.openxmlformats.org/drawingml/2006/main" noChangeAspect="1"/>
+            </wp:cNvGraphicFramePr>
+            <a:graphic xmlns:a="http://schemas.openxmlformats.org/drawingml/2006/main">
+              <a:graphicData uri="http://schemas.openxmlformats.org/drawingml/2006/picture">
+                <pic:pic xmlns:pic="http://schemas.openxmlformats.org/drawingml/2006/picture">
+                  <pic:nvPicPr>
+                    <pic:cNvPr id="1757553420" name="Kép 1" descr="A képen szöveg, elektronika, képernyőkép, Betűtípus látható&#10;&#10;Előfordulhat, hogy az AI által létrehozott tartalom helytelen."/>
+                    <pic:cNvPicPr/>
+                  </pic:nvPicPr>
+                  <pic:blipFill>
+                    <a:blip r:embed="rId30"/>
+                    <a:stretch>
+                      <a:fillRect/>
+                    </a:stretch>
+                  </pic:blipFill>
+                  <pic:spPr>
+                    <a:xfrm>
+                      <a:off x="0" y="0"/>
+                      <a:ext cx="3587934" cy="2578233"/>
+                    </a:xfrm>
+                    <a:prstGeom prst="rect">
+                      <a:avLst/>
+                    </a:prstGeom>
+                  </pic:spPr>
+                </pic:pic>
+              </a:graphicData>
+            </a:graphic>
+          </wp:inline>
+        </w:drawing>
+      </w:r>
+    </w:p>
+    <w:p>
+      <w:pPr>
+        <w:jc w:val="center"/>
+        <w:rPr>
+          <w:rFonts w:ascii="Times New Roman" w:hAnsi="Times New Roman" w:cs="Times New Roman"/>
+        </w:rPr>
+      </w:pPr>
+    </w:p>
+    <w:p>
+      <w:pPr>
+        <w:jc w:val="center"/>
+        <w:rPr>
+          <w:rFonts w:ascii="Times New Roman" w:hAnsi="Times New Roman" w:cs="Times New Roman"/>
+        </w:rPr>
+      </w:pPr>
+    </w:p>
+    <w:p>
+      <w:pPr>
+        <w:jc w:val="center"/>
+        <w:rPr>
+          <w:rFonts w:ascii="Times New Roman" w:hAnsi="Times New Roman" w:cs="Times New Roman"/>
+        </w:rPr>
+      </w:pPr>
+    </w:p>
+    <w:p>
+      <w:pPr>
+        <w:jc w:val="center"/>
+        <w:rPr>
+          <w:rFonts w:ascii="Times New Roman" w:hAnsi="Times New Roman" w:cs="Times New Roman"/>
+        </w:rPr>
+      </w:pPr>
+    </w:p>
+    <w:p>
+      <w:pPr>
+        <w:jc w:val="center"/>
+        <w:rPr>
+          <w:rFonts w:ascii="Times New Roman" w:hAnsi="Times New Roman" w:cs="Times New Roman"/>
+        </w:rPr>
+      </w:pPr>
+    </w:p>
+    <w:p>
+      <w:pPr>
+        <w:jc w:val="center"/>
+        <w:rPr>
+          <w:rFonts w:ascii="Times New Roman" w:hAnsi="Times New Roman" w:cs="Times New Roman"/>
+        </w:rPr>
+      </w:pPr>
+    </w:p>
+    <w:p>
+      <w:pPr>
+        <w:rPr>
+          <w:rFonts w:ascii="Times New Roman" w:hAnsi="Times New Roman" w:cs="Times New Roman"/>
+        </w:rPr>
+      </w:pPr>
+      <w:r>
+        <w:rPr>
+          <w:rFonts w:ascii="Times New Roman" w:hAnsi="Times New Roman" w:cs="Times New Roman"/>
+        </w:rPr>
+        <w:lastRenderedPageBreak/>
+        <w:t xml:space="preserve">Engedélyezni kell a DHCP-t az AD-ban. </w:t>
+      </w:r>
+      <w:r>
+        <w:rPr>
+          <w:rFonts w:ascii="Times New Roman" w:hAnsi="Times New Roman" w:cs="Times New Roman"/>
+        </w:rPr>
+        <w:t>Látható, hogy futnak a szerverszolgáltatások.</w:t>
+      </w:r>
+    </w:p>
+    <w:p>
+      <w:pPr>
+        <w:jc w:val="center"/>
+        <w:rPr>
+          <w:rFonts w:ascii="Times New Roman" w:hAnsi="Times New Roman" w:cs="Times New Roman"/>
+        </w:rPr>
+      </w:pPr>
+      <w:r>
+        <w:rPr>
+          <w:rFonts w:ascii="Times New Roman" w:hAnsi="Times New Roman" w:cs="Times New Roman"/>
+        </w:rPr>
+        <w:drawing>
+          <wp:inline distT="0" distB="0" distL="0" distR="0" wp14:anchorId="42B59769" wp14:editId="4D67FDB8">
+            <wp:extent cx="3054507" cy="1600282"/>
+            <wp:effectExtent l="0" t="0" r="0" b="0"/>
+            <wp:docPr id="1031001063" name="Kép 1" descr="A képen szöveg, képernyőkép, Betűtípus, sor látható&#10;&#10;Előfordulhat, hogy az AI által létrehozott tartalom helytelen."/>
+            <wp:cNvGraphicFramePr>
+              <a:graphicFrameLocks xmlns:a="http://schemas.openxmlformats.org/drawingml/2006/main" noChangeAspect="1"/>
+            </wp:cNvGraphicFramePr>
+            <a:graphic xmlns:a="http://schemas.openxmlformats.org/drawingml/2006/main">
+              <a:graphicData uri="http://schemas.openxmlformats.org/drawingml/2006/picture">
+                <pic:pic xmlns:pic="http://schemas.openxmlformats.org/drawingml/2006/picture">
+                  <pic:nvPicPr>
+                    <pic:cNvPr id="1031001063" name="Kép 1" descr="A képen szöveg, képernyőkép, Betűtípus, sor látható&#10;&#10;Előfordulhat, hogy az AI által létrehozott tartalom helytelen."/>
+                    <pic:cNvPicPr/>
+                  </pic:nvPicPr>
+                  <pic:blipFill>
+                    <a:blip r:embed="rId31"/>
+                    <a:stretch>
+                      <a:fillRect/>
+                    </a:stretch>
+                  </pic:blipFill>
+                  <pic:spPr>
+                    <a:xfrm>
+                      <a:off x="0" y="0"/>
+                      <a:ext cx="3054507" cy="1600282"/>
+                    </a:xfrm>
+                    <a:prstGeom prst="rect">
+                      <a:avLst/>
+                    </a:prstGeom>
+                  </pic:spPr>
+                </pic:pic>
+              </a:graphicData>
+            </a:graphic>
+          </wp:inline>
+        </w:drawing>
+      </w:r>
+    </w:p>
+    <w:p>
+      <w:pPr>
+        <w:jc w:val="center"/>
+        <w:rPr>
+          <w:rFonts w:ascii="Times New Roman" w:hAnsi="Times New Roman" w:cs="Times New Roman"/>
+        </w:rPr>
+      </w:pPr>
+      <w:r>
+        <w:rPr>
+          <w:rFonts w:ascii="Times New Roman" w:hAnsi="Times New Roman" w:cs="Times New Roman"/>
+        </w:rPr>
+        <w:drawing>
+          <wp:inline distT="0" distB="0" distL="0" distR="0" wp14:anchorId="1A04D4BA" wp14:editId="1712F359">
+            <wp:extent cx="2957886" cy="3296790"/>
+            <wp:effectExtent l="0" t="0" r="0" b="0"/>
+            <wp:docPr id="362078367" name="Kép 1" descr="A képen szöveg, képernyőkép, szoftver, Számítógépes ikon látható&#10;&#10;Előfordulhat, hogy az AI által létrehozott tartalom helytelen."/>
+            <wp:cNvGraphicFramePr>
+              <a:graphicFrameLocks xmlns:a="http://schemas.openxmlformats.org/drawingml/2006/main" noChangeAspect="1"/>
+            </wp:cNvGraphicFramePr>
+            <a:graphic xmlns:a="http://schemas.openxmlformats.org/drawingml/2006/main">
+              <a:graphicData uri="http://schemas.openxmlformats.org/drawingml/2006/picture">
+                <pic:pic xmlns:pic="http://schemas.openxmlformats.org/drawingml/2006/picture">
+                  <pic:nvPicPr>
+                    <pic:cNvPr id="362078367" name="Kép 1" descr="A képen szöveg, képernyőkép, szoftver, Számítógépes ikon látható&#10;&#10;Előfordulhat, hogy az AI által létrehozott tartalom helytelen."/>
+                    <pic:cNvPicPr/>
+                  </pic:nvPicPr>
+                  <pic:blipFill rotWithShape="1">
+                    <a:blip r:embed="rId32"/>
+                    <a:srcRect l="11525" t="13090" r="30716"/>
+                    <a:stretch>
+                      <a:fillRect/>
+                    </a:stretch>
+                  </pic:blipFill>
+                  <pic:spPr bwMode="auto">
+                    <a:xfrm>
+                      <a:off x="0" y="0"/>
+                      <a:ext cx="2989096" cy="3331576"/>
+                    </a:xfrm>
+                    <a:prstGeom prst="rect">
+                      <a:avLst/>
+                    </a:prstGeom>
+                    <a:ln>
+                      <a:noFill/>
+                    </a:ln>
+                    <a:extLst>
+                      <a:ext uri="{53640926-AAD7-44D8-BBD7-CCE9431645EC}">
+                        <a14:shadowObscured xmlns:a14="http://schemas.microsoft.com/office/drawing/2010/main"/>
+                      </a:ext>
+                    </a:extLst>
+                  </pic:spPr>
+                </pic:pic>
+              </a:graphicData>
+            </a:graphic>
+          </wp:inline>
+        </w:drawing>
+      </w:r>
+    </w:p>
+    <w:p>
+      <w:pPr>
+        <w:jc w:val="center"/>
+        <w:rPr>
+          <w:rFonts w:ascii="Times New Roman" w:hAnsi="Times New Roman" w:cs="Times New Roman"/>
+        </w:rPr>
+      </w:pPr>
+      <w:r>
+        <w:rPr>
+          <w:rFonts w:ascii="Times New Roman" w:hAnsi="Times New Roman" w:cs="Times New Roman"/>
+        </w:rPr>
+        <w:drawing>
+          <wp:inline distT="0" distB="0" distL="0" distR="0" wp14:anchorId="5DEB19A5" wp14:editId="06AB18E9">
+            <wp:extent cx="3721291" cy="2521080"/>
+            <wp:effectExtent l="0" t="0" r="0" b="0"/>
+            <wp:docPr id="1260432548" name="Kép 1" descr="A képen szöveg, képernyőkép, szoftver, Számítógépes ikon látható&#10;&#10;Előfordulhat, hogy az AI által létrehozott tartalom helytelen."/>
+            <wp:cNvGraphicFramePr>
+              <a:graphicFrameLocks xmlns:a="http://schemas.openxmlformats.org/drawingml/2006/main" noChangeAspect="1"/>
+            </wp:cNvGraphicFramePr>
+            <a:graphic xmlns:a="http://schemas.openxmlformats.org/drawingml/2006/main">
+              <a:graphicData uri="http://schemas.openxmlformats.org/drawingml/2006/picture">
+                <pic:pic xmlns:pic="http://schemas.openxmlformats.org/drawingml/2006/picture">
+                  <pic:nvPicPr>
+                    <pic:cNvPr id="1260432548" name="Kép 1" descr="A képen szöveg, képernyőkép, szoftver, Számítógépes ikon látható&#10;&#10;Előfordulhat, hogy az AI által létrehozott tartalom helytelen."/>
+                    <pic:cNvPicPr/>
+                  </pic:nvPicPr>
+                  <pic:blipFill>
+                    <a:blip r:embed="rId33"/>
+                    <a:stretch>
+                      <a:fillRect/>
+                    </a:stretch>
+                  </pic:blipFill>
+                  <pic:spPr>
+                    <a:xfrm>
+                      <a:off x="0" y="0"/>
+                      <a:ext cx="3721291" cy="2521080"/>
+                    </a:xfrm>
+                    <a:prstGeom prst="rect">
+                      <a:avLst/>
+                    </a:prstGeom>
+                  </pic:spPr>
+                </pic:pic>
+              </a:graphicData>
+            </a:graphic>
+          </wp:inline>
+        </w:drawing>
+      </w:r>
+    </w:p>
+    <w:p>
+      <w:pPr>
+        <w:rPr>
+          <w:rFonts w:ascii="Times New Roman" w:hAnsi="Times New Roman" w:cs="Times New Roman"/>
+          <w:highlight w:val="cyan"/>
+        </w:rPr>
+      </w:pPr>
+    </w:p>
+    <w:p>
+      <w:pPr>
+        <w:rPr>
+          <w:rFonts w:ascii="Times New Roman" w:hAnsi="Times New Roman" w:cs="Times New Roman"/>
+          <w:highlight w:val="cyan"/>
+        </w:rPr>
+      </w:pPr>
+    </w:p>
+    <w:p>
+      <w:pPr>
+        <w:rPr>
+          <w:rFonts w:ascii="Times New Roman" w:hAnsi="Times New Roman" w:cs="Times New Roman"/>
+        </w:rPr>
+      </w:pPr>
+      <w:r>
+        <w:rPr>
+          <w:rFonts w:ascii="Times New Roman" w:hAnsi="Times New Roman" w:cs="Times New Roman"/>
+          <w:highlight w:val="cyan"/>
+        </w:rPr>
+        <w:lastRenderedPageBreak/>
+        <w:t>DHCP setup:</w:t>
+      </w:r>
+    </w:p>
+    <w:p>
+      <w:pPr>
+        <w:jc w:val="both"/>
+        <w:rPr>
+          <w:rFonts w:ascii="Times New Roman" w:hAnsi="Times New Roman" w:cs="Times New Roman"/>
+        </w:rPr>
+      </w:pPr>
+      <w:r>
+        <w:rPr>
+          <w:rFonts w:ascii="Times New Roman" w:hAnsi="Times New Roman" w:cs="Times New Roman"/>
+        </w:rPr>
+        <w:t>Létrehozom a scope-ot</w:t>
+      </w:r>
+      <w:r>
+        <w:rPr>
+          <w:rFonts w:ascii="Times New Roman" w:hAnsi="Times New Roman" w:cs="Times New Roman"/>
+        </w:rPr>
+        <w:t xml:space="preserve">, egyelőre egyet, ami a </w:t>
+      </w:r>
+      <w:r>
+        <w:rPr>
+          <w:rFonts w:ascii="Times New Roman" w:hAnsi="Times New Roman" w:cs="Times New Roman"/>
+        </w:rPr>
+        <w:t>Debrecenben</w:t>
+      </w:r>
+      <w:r>
+        <w:rPr>
+          <w:rFonts w:ascii="Times New Roman" w:hAnsi="Times New Roman" w:cs="Times New Roman"/>
+        </w:rPr>
+        <w:t xml:space="preserve"> oszt ki címeket</w:t>
+      </w:r>
+      <w:r>
+        <w:rPr>
+          <w:rFonts w:ascii="Times New Roman" w:hAnsi="Times New Roman" w:cs="Times New Roman"/>
+        </w:rPr>
+        <w:t xml:space="preserve"> a</w:t>
+      </w:r>
+      <w:r>
+        <w:rPr>
+          <w:rFonts w:ascii="Times New Roman" w:hAnsi="Times New Roman" w:cs="Times New Roman"/>
+        </w:rPr>
+        <w:t xml:space="preserve"> felhasználóknak</w:t>
+      </w:r>
+      <w:r>
+        <w:rPr>
+          <w:rFonts w:ascii="Times New Roman" w:hAnsi="Times New Roman" w:cs="Times New Roman"/>
+        </w:rPr>
+        <w:t xml:space="preserve">. </w:t>
+      </w:r>
+      <w:r>
+        <w:rPr>
+          <w:rFonts w:ascii="Times New Roman" w:hAnsi="Times New Roman" w:cs="Times New Roman"/>
+        </w:rPr>
+        <w:t xml:space="preserve">50 címet tud összesen kiosztani, de debrecenbe ennél több nem is kell, adminok és rendszergazdág esetleg DevOpsos fejlesztők veszik igénybe a hálózatot, ezekenek a klienseknek általában nincs nagy számuk. </w:t>
+      </w:r>
+      <w:r>
+        <w:rPr>
+          <w:rFonts w:ascii="Times New Roman" w:hAnsi="Times New Roman" w:cs="Times New Roman"/>
+        </w:rPr>
+        <w:t>Kapott a scope egy 2</w:t>
+      </w:r>
+      <w:r>
+        <w:rPr>
+          <w:rFonts w:ascii="Times New Roman" w:hAnsi="Times New Roman" w:cs="Times New Roman"/>
+        </w:rPr>
+        <w:t>3</w:t>
+      </w:r>
+      <w:r>
+        <w:rPr>
+          <w:rFonts w:ascii="Times New Roman" w:hAnsi="Times New Roman" w:cs="Times New Roman"/>
+        </w:rPr>
+        <w:t xml:space="preserve"> </w:t>
+      </w:r>
+      <w:r>
+        <w:rPr>
+          <w:rFonts w:ascii="Times New Roman" w:hAnsi="Times New Roman" w:cs="Times New Roman"/>
+        </w:rPr>
+        <w:t xml:space="preserve">órás lease timeot, ami után újraoszt címeket minden kliensnek. </w:t>
+      </w:r>
+    </w:p>
+    <w:p>
+      <w:pPr>
+        <w:jc w:val="center"/>
+        <w:rPr>
+          <w:rFonts w:ascii="Times New Roman" w:hAnsi="Times New Roman" w:cs="Times New Roman"/>
+        </w:rPr>
+      </w:pPr>
+      <w:r>
+        <w:rPr>
+          <w:rFonts w:ascii="Times New Roman" w:hAnsi="Times New Roman" w:cs="Times New Roman"/>
+        </w:rPr>
+        <w:drawing>
+          <wp:inline distT="0" distB="0" distL="0" distR="0" wp14:anchorId="49599499" wp14:editId="510EFB4F">
+            <wp:extent cx="5512083" cy="2667137"/>
+            <wp:effectExtent l="0" t="0" r="0" b="0"/>
+            <wp:docPr id="1271846933" name="Kép 1" descr="A képen szöveg, képernyőkép, szoftver, Számítógépes ikon látható&#10;&#10;Előfordulhat, hogy az AI által létrehozott tartalom helytelen."/>
+            <wp:cNvGraphicFramePr>
+              <a:graphicFrameLocks xmlns:a="http://schemas.openxmlformats.org/drawingml/2006/main" noChangeAspect="1"/>
+            </wp:cNvGraphicFramePr>
+            <a:graphic xmlns:a="http://schemas.openxmlformats.org/drawingml/2006/main">
+              <a:graphicData uri="http://schemas.openxmlformats.org/drawingml/2006/picture">
+                <pic:pic xmlns:pic="http://schemas.openxmlformats.org/drawingml/2006/picture">
+                  <pic:nvPicPr>
+                    <pic:cNvPr id="1271846933" name="Kép 1" descr="A képen szöveg, képernyőkép, szoftver, Számítógépes ikon látható&#10;&#10;Előfordulhat, hogy az AI által létrehozott tartalom helytelen."/>
+                    <pic:cNvPicPr/>
+                  </pic:nvPicPr>
+                  <pic:blipFill>
+                    <a:blip r:embed="rId34"/>
+                    <a:stretch>
+                      <a:fillRect/>
+                    </a:stretch>
+                  </pic:blipFill>
+                  <pic:spPr>
+                    <a:xfrm>
+                      <a:off x="0" y="0"/>
+                      <a:ext cx="5512083" cy="2667137"/>
+                    </a:xfrm>
+                    <a:prstGeom prst="rect">
+                      <a:avLst/>
+                    </a:prstGeom>
+                  </pic:spPr>
+                </pic:pic>
+              </a:graphicData>
+            </a:graphic>
+          </wp:inline>
+        </w:drawing>
+      </w:r>
+    </w:p>
+    <w:p>
+      <w:pPr>
+        <w:jc w:val="center"/>
+        <w:rPr>
+          <w:rFonts w:ascii="Times New Roman" w:hAnsi="Times New Roman" w:cs="Times New Roman"/>
+        </w:rPr>
+      </w:pPr>
+      <w:r>
+        <w:rPr>
+          <w:rFonts w:ascii="Times New Roman" w:hAnsi="Times New Roman" w:cs="Times New Roman"/>
+        </w:rPr>
+        <w:drawing>
+          <wp:inline distT="0" distB="0" distL="0" distR="0" wp14:anchorId="51426D17" wp14:editId="06DFB5B8">
+            <wp:extent cx="5512083" cy="2673487"/>
+            <wp:effectExtent l="0" t="0" r="0" b="0"/>
+            <wp:docPr id="36376590" name="Kép 1" descr="A képen szöveg, képernyőkép, szoftver, Számítógépes ikon látható&#10;&#10;Előfordulhat, hogy az AI által létrehozott tartalom helytelen."/>
+            <wp:cNvGraphicFramePr>
+              <a:graphicFrameLocks xmlns:a="http://schemas.openxmlformats.org/drawingml/2006/main" noChangeAspect="1"/>
+            </wp:cNvGraphicFramePr>
+            <a:graphic xmlns:a="http://schemas.openxmlformats.org/drawingml/2006/main">
+              <a:graphicData uri="http://schemas.openxmlformats.org/drawingml/2006/picture">
+                <pic:pic xmlns:pic="http://schemas.openxmlformats.org/drawingml/2006/picture">
+                  <pic:nvPicPr>
+                    <pic:cNvPr id="36376590" name="Kép 1" descr="A képen szöveg, képernyőkép, szoftver, Számítógépes ikon látható&#10;&#10;Előfordulhat, hogy az AI által létrehozott tartalom helytelen."/>
+                    <pic:cNvPicPr/>
+                  </pic:nvPicPr>
+                  <pic:blipFill>
+                    <a:blip r:embed="rId35"/>
+                    <a:stretch>
+                      <a:fillRect/>
+                    </a:stretch>
+                  </pic:blipFill>
+                  <pic:spPr>
+                    <a:xfrm>
+                      <a:off x="0" y="0"/>
+                      <a:ext cx="5512083" cy="2673487"/>
+                    </a:xfrm>
+                    <a:prstGeom prst="rect">
+                      <a:avLst/>
+                    </a:prstGeom>
+                  </pic:spPr>
+                </pic:pic>
+              </a:graphicData>
+            </a:graphic>
+          </wp:inline>
+        </w:drawing>
+      </w:r>
+    </w:p>
+    <w:p>
+      <w:pPr>
+        <w:jc w:val="center"/>
+        <w:rPr>
+          <w:rFonts w:ascii="Times New Roman" w:hAnsi="Times New Roman" w:cs="Times New Roman"/>
+        </w:rPr>
+      </w:pPr>
+    </w:p>
+    <w:p>
+      <w:pPr>
+        <w:rPr>
+          <w:rFonts w:ascii="Times New Roman" w:hAnsi="Times New Roman" w:cs="Times New Roman"/>
+        </w:rPr>
+      </w:pPr>
+    </w:p>
+    <w:p>
+      <w:pPr>
+        <w:rPr>
+          <w:rFonts w:ascii="Times New Roman" w:hAnsi="Times New Roman" w:cs="Times New Roman"/>
+        </w:rPr>
+      </w:pPr>
+    </w:p>
+    <w:p>
+      <w:pPr>
+        <w:rPr>
+          <w:rFonts w:ascii="Times New Roman" w:hAnsi="Times New Roman" w:cs="Times New Roman"/>
+        </w:rPr>
+      </w:pPr>
+    </w:p>
+    <w:p>
+      <w:pPr>
+        <w:rPr>
+          <w:rFonts w:ascii="Times New Roman" w:hAnsi="Times New Roman" w:cs="Times New Roman"/>
+        </w:rPr>
+      </w:pPr>
+    </w:p>
+    <w:p>
+      <w:pPr>
+        <w:rPr>
+          <w:rFonts w:ascii="Times New Roman" w:hAnsi="Times New Roman" w:cs="Times New Roman"/>
+        </w:rPr>
+      </w:pPr>
+    </w:p>
+    <w:p>
+      <w:pPr>
+        <w:rPr>
+          <w:rFonts w:ascii="Times New Roman" w:hAnsi="Times New Roman" w:cs="Times New Roman"/>
+        </w:rPr>
+      </w:pPr>
+      <w:r>
+        <w:rPr>
+          <w:rFonts w:ascii="Times New Roman" w:hAnsi="Times New Roman" w:cs="Times New Roman"/>
+        </w:rPr>
+        <w:lastRenderedPageBreak/>
+        <w:t xml:space="preserve">Itt látható a </w:t>
+      </w:r>
+      <w:r>
+        <w:rPr>
+          <w:rFonts w:ascii="Times New Roman" w:hAnsi="Times New Roman" w:cs="Times New Roman"/>
+        </w:rPr>
+        <w:t>DHCP scope, amit konfiguráltam.</w:t>
+      </w:r>
+    </w:p>
+    <w:p>
+      <w:pPr>
+        <w:jc w:val="center"/>
+        <w:rPr>
+          <w:rFonts w:ascii="Times New Roman" w:hAnsi="Times New Roman" w:cs="Times New Roman"/>
+        </w:rPr>
+      </w:pPr>
+      <w:r>
+        <w:rPr>
+          <w:rFonts w:ascii="Times New Roman" w:hAnsi="Times New Roman" w:cs="Times New Roman"/>
+        </w:rPr>
+        <w:drawing>
+          <wp:inline distT="0" distB="0" distL="0" distR="0" wp14:anchorId="5CDCC8C2" wp14:editId="1D0E9A50">
+            <wp:extent cx="5073911" cy="2502029"/>
+            <wp:effectExtent l="0" t="0" r="0" b="0"/>
+            <wp:docPr id="439432378" name="Kép 1"/>
+            <wp:cNvGraphicFramePr>
+              <a:graphicFrameLocks xmlns:a="http://schemas.openxmlformats.org/drawingml/2006/main" noChangeAspect="1"/>
+            </wp:cNvGraphicFramePr>
+            <a:graphic xmlns:a="http://schemas.openxmlformats.org/drawingml/2006/main">
+              <a:graphicData uri="http://schemas.openxmlformats.org/drawingml/2006/picture">
+                <pic:pic xmlns:pic="http://schemas.openxmlformats.org/drawingml/2006/picture">
+                  <pic:nvPicPr>
+                    <pic:cNvPr id="439432378" name=""/>
+                    <pic:cNvPicPr/>
+                  </pic:nvPicPr>
+                  <pic:blipFill>
+                    <a:blip r:embed="rId36"/>
+                    <a:stretch>
+                      <a:fillRect/>
+                    </a:stretch>
+                  </pic:blipFill>
+                  <pic:spPr>
+                    <a:xfrm>
+                      <a:off x="0" y="0"/>
+                      <a:ext cx="5073911" cy="2502029"/>
+                    </a:xfrm>
+                    <a:prstGeom prst="rect">
+                      <a:avLst/>
+                    </a:prstGeom>
+                  </pic:spPr>
+                </pic:pic>
+              </a:graphicData>
+            </a:graphic>
+          </wp:inline>
+        </w:drawing>
+      </w:r>
+    </w:p>
+    <w:p>
+      <w:pPr>
+        <w:rPr>
+          <w:rFonts w:ascii="Times New Roman" w:hAnsi="Times New Roman" w:cs="Times New Roman"/>
+        </w:rPr>
+      </w:pPr>
+      <w:r>
+        <w:rPr>
+          <w:rFonts w:ascii="Times New Roman" w:hAnsi="Times New Roman" w:cs="Times New Roman"/>
+        </w:rPr>
+        <w:t>NEM MUKODIK A KIBASZOTT DNS, AZZAL KELL MEG VALAMIT KEZDENI!!!!!</w:t>
+      </w:r>
+    </w:p>
+    <w:p>
+      <w:pPr>
+        <w:rPr>
+          <w:rFonts w:ascii="Times New Roman" w:hAnsi="Times New Roman" w:cs="Times New Roman"/>
+        </w:rPr>
+      </w:pPr>
+    </w:p>
+    <w:p>
+      <w:pPr>
+        <w:rPr>
+          <w:rFonts w:ascii="Times New Roman" w:hAnsi="Times New Roman" w:cs="Times New Roman"/>
+        </w:rPr>
+      </w:pPr>
     </w:p>
     <w:sectPr>
-      <w:headerReference w:type="default" r:id="rId23"/>
+      <w:headerReference w:type="default" r:id="rId37"/>
       <w:pgSz w:w="11906" w:h="16838"/>
       <w:pgMar w:top="1417" w:right="1417" w:bottom="1417" w:left="1417" w:header="708" w:footer="708" w:gutter="0"/>
       <w:cols w:space="708"/>

</xml_diff>

<commit_message>
dhcp szerver tesztelésébe segítséget kell kérnem MB-től
</commit_message>
<xml_diff>
--- a/Címtár és DHCP szolgáltatás Windowson.docx
+++ b/Címtár és DHCP szolgáltatás Windowson.docx
@@ -725,6 +725,7 @@
       <w:r>
         <w:rPr>
           <w:rFonts w:ascii="Times New Roman" w:hAnsi="Times New Roman" w:cs="Times New Roman"/>
+          <w:noProof/>
         </w:rPr>
         <w:drawing>
           <wp:inline distT="0" distB="0" distL="0" distR="0" wp14:anchorId="107A0A4E" wp14:editId="52B6A78F">
@@ -773,6 +774,7 @@
       <w:r>
         <w:rPr>
           <w:rFonts w:ascii="Times New Roman" w:hAnsi="Times New Roman" w:cs="Times New Roman"/>
+          <w:noProof/>
         </w:rPr>
         <w:drawing>
           <wp:inline distT="0" distB="0" distL="0" distR="0" wp14:anchorId="71B0CB27" wp14:editId="1A4E578F">
@@ -821,6 +823,7 @@
       <w:r>
         <w:rPr>
           <w:rFonts w:ascii="Times New Roman" w:hAnsi="Times New Roman" w:cs="Times New Roman"/>
+          <w:noProof/>
         </w:rPr>
         <w:drawing>
           <wp:inline distT="0" distB="0" distL="0" distR="0" wp14:anchorId="01064CBB" wp14:editId="2D06A7D6">
@@ -982,6 +985,7 @@
       <w:r>
         <w:rPr>
           <w:rFonts w:ascii="Times New Roman" w:hAnsi="Times New Roman" w:cs="Times New Roman"/>
+          <w:noProof/>
         </w:rPr>
         <w:drawing>
           <wp:inline distT="0" distB="0" distL="0" distR="0" wp14:anchorId="43EA2C54" wp14:editId="6093F703">
@@ -1030,6 +1034,7 @@
       <w:r>
         <w:rPr>
           <w:rFonts w:ascii="Times New Roman" w:hAnsi="Times New Roman" w:cs="Times New Roman"/>
+          <w:noProof/>
         </w:rPr>
         <w:drawing>
           <wp:inline distT="0" distB="0" distL="0" distR="0" wp14:anchorId="3E32A68B" wp14:editId="5B925FBB">
@@ -1078,6 +1083,7 @@
       <w:r>
         <w:rPr>
           <w:rFonts w:ascii="Times New Roman" w:hAnsi="Times New Roman" w:cs="Times New Roman"/>
+          <w:noProof/>
         </w:rPr>
         <w:lastRenderedPageBreak/>
         <w:drawing>
@@ -1147,6 +1153,7 @@
       <w:r>
         <w:rPr>
           <w:rFonts w:ascii="Times New Roman" w:hAnsi="Times New Roman" w:cs="Times New Roman"/>
+          <w:noProof/>
         </w:rPr>
         <w:drawing>
           <wp:inline distT="0" distB="0" distL="0" distR="0" wp14:anchorId="60BA3F3E" wp14:editId="4F2FF439">
@@ -1765,6 +1772,7 @@
       <w:r>
         <w:rPr>
           <w:rFonts w:ascii="Times New Roman" w:hAnsi="Times New Roman" w:cs="Times New Roman"/>
+          <w:noProof/>
         </w:rPr>
         <w:drawing>
           <wp:inline distT="0" distB="0" distL="0" distR="0" wp14:anchorId="7E587D3F" wp14:editId="56AFEED7">
@@ -1926,6 +1934,7 @@
       <w:r>
         <w:rPr>
           <w:rFonts w:ascii="Times New Roman" w:hAnsi="Times New Roman" w:cs="Times New Roman"/>
+          <w:noProof/>
         </w:rPr>
         <w:drawing>
           <wp:inline distT="0" distB="0" distL="0" distR="0" wp14:anchorId="2BAF313B" wp14:editId="08F63A54">
@@ -1974,6 +1983,7 @@
       <w:r>
         <w:rPr>
           <w:rFonts w:ascii="Times New Roman" w:hAnsi="Times New Roman" w:cs="Times New Roman"/>
+          <w:noProof/>
         </w:rPr>
         <w:drawing>
           <wp:inline distT="0" distB="0" distL="0" distR="0" wp14:anchorId="123EB5CD" wp14:editId="796A9CC0">
@@ -2022,6 +2032,7 @@
       <w:r>
         <w:rPr>
           <w:rFonts w:ascii="Times New Roman" w:hAnsi="Times New Roman" w:cs="Times New Roman"/>
+          <w:noProof/>
         </w:rPr>
         <w:drawing>
           <wp:inline distT="0" distB="0" distL="0" distR="0" wp14:anchorId="3988EEA1" wp14:editId="472882DD">
@@ -2236,6 +2247,7 @@
       <w:r>
         <w:rPr>
           <w:rFonts w:ascii="Times New Roman" w:hAnsi="Times New Roman" w:cs="Times New Roman"/>
+          <w:noProof/>
         </w:rPr>
         <w:drawing>
           <wp:inline distT="0" distB="0" distL="0" distR="0" wp14:anchorId="7B0D4D5F" wp14:editId="61A431B4">
@@ -2304,6 +2316,7 @@
       <w:r>
         <w:rPr>
           <w:rFonts w:ascii="Times New Roman" w:hAnsi="Times New Roman" w:cs="Times New Roman"/>
+          <w:noProof/>
         </w:rPr>
         <w:drawing>
           <wp:inline distT="0" distB="0" distL="0" distR="0" wp14:anchorId="011EAD2F" wp14:editId="02E4A3F9">
@@ -2352,6 +2365,7 @@
       <w:r>
         <w:rPr>
           <w:rFonts w:ascii="Times New Roman" w:hAnsi="Times New Roman" w:cs="Times New Roman"/>
+          <w:noProof/>
         </w:rPr>
         <w:lastRenderedPageBreak/>
         <w:drawing>
@@ -2401,6 +2415,7 @@
       <w:r>
         <w:rPr>
           <w:rFonts w:ascii="Times New Roman" w:hAnsi="Times New Roman" w:cs="Times New Roman"/>
+          <w:noProof/>
         </w:rPr>
         <w:drawing>
           <wp:inline distT="0" distB="0" distL="0" distR="0" wp14:anchorId="399449C1" wp14:editId="72D90844">
@@ -3069,6 +3084,7 @@
       <w:r>
         <w:rPr>
           <w:rFonts w:ascii="Times New Roman" w:hAnsi="Times New Roman" w:cs="Times New Roman"/>
+          <w:noProof/>
         </w:rPr>
         <w:drawing>
           <wp:inline distT="0" distB="0" distL="0" distR="0" wp14:anchorId="00C7A91E" wp14:editId="190732C9">
@@ -3117,6 +3133,7 @@
       <w:r>
         <w:rPr>
           <w:rFonts w:ascii="Times New Roman" w:hAnsi="Times New Roman" w:cs="Times New Roman"/>
+          <w:noProof/>
         </w:rPr>
         <w:lastRenderedPageBreak/>
         <w:drawing>
@@ -3207,6 +3224,80 @@
         </w:rPr>
         <w:t>.</w:t>
       </w:r>
+      <w:r>
+        <w:rPr>
+          <w:rFonts w:ascii="Times New Roman" w:hAnsi="Times New Roman" w:cs="Times New Roman"/>
+        </w:rPr>
+        <w:t xml:space="preserve"> Ezt egy másik címtartományra hozzuk létre a szimuláció érdekében. Beállítjuk, hogy a szerverünk viselkedjen </w:t>
+      </w:r>
+      <w:proofErr w:type="spellStart"/>
+      <w:r>
+        <w:rPr>
+          <w:rFonts w:ascii="Times New Roman" w:hAnsi="Times New Roman" w:cs="Times New Roman"/>
+        </w:rPr>
+        <w:t>default-gatewayként</w:t>
+      </w:r>
+      <w:proofErr w:type="spellEnd"/>
+      <w:r>
+        <w:rPr>
+          <w:rFonts w:ascii="Times New Roman" w:hAnsi="Times New Roman" w:cs="Times New Roman"/>
+        </w:rPr>
+        <w:t xml:space="preserve"> és osszon címeket </w:t>
+      </w:r>
+      <w:proofErr w:type="spellStart"/>
+      <w:r>
+        <w:rPr>
+          <w:rFonts w:ascii="Times New Roman" w:hAnsi="Times New Roman" w:cs="Times New Roman"/>
+        </w:rPr>
+        <w:t>host-only</w:t>
+      </w:r>
+      <w:proofErr w:type="spellEnd"/>
+      <w:r>
+        <w:rPr>
+          <w:rFonts w:ascii="Times New Roman" w:hAnsi="Times New Roman" w:cs="Times New Roman"/>
+        </w:rPr>
+        <w:t xml:space="preserve"> kártyán egy másik hálózatnak, ami a debreceni hálón belül fog egy </w:t>
+      </w:r>
+      <w:proofErr w:type="spellStart"/>
+      <w:r>
+        <w:rPr>
+          <w:rFonts w:ascii="Times New Roman" w:hAnsi="Times New Roman" w:cs="Times New Roman"/>
+        </w:rPr>
+        <w:t>area</w:t>
+      </w:r>
+      <w:proofErr w:type="spellEnd"/>
+      <w:r>
+        <w:rPr>
+          <w:rFonts w:ascii="Times New Roman" w:hAnsi="Times New Roman" w:cs="Times New Roman"/>
+        </w:rPr>
+        <w:t>-t szimulálni.</w:t>
+      </w:r>
+      <w:r>
+        <w:rPr>
+          <w:rFonts w:ascii="Times New Roman" w:hAnsi="Times New Roman" w:cs="Times New Roman"/>
+        </w:rPr>
+        <w:t xml:space="preserve"> 23 óránként megújítja a címeket az </w:t>
+      </w:r>
+      <w:proofErr w:type="spellStart"/>
+      <w:r>
+        <w:rPr>
+          <w:rFonts w:ascii="Times New Roman" w:hAnsi="Times New Roman" w:cs="Times New Roman"/>
+        </w:rPr>
+        <w:t>area</w:t>
+      </w:r>
+      <w:proofErr w:type="spellEnd"/>
+      <w:r>
+        <w:rPr>
+          <w:rFonts w:ascii="Times New Roman" w:hAnsi="Times New Roman" w:cs="Times New Roman"/>
+        </w:rPr>
+        <w:t xml:space="preserve"> 40-nek. </w:t>
+      </w:r>
+      <w:r>
+        <w:rPr>
+          <w:rFonts w:ascii="Times New Roman" w:hAnsi="Times New Roman" w:cs="Times New Roman"/>
+        </w:rPr>
+        <w:t>DNS-nek beállítottam a NAT-olt kártyán lévő felkonfigurált DNS címet</w:t>
+      </w:r>
     </w:p>
     <w:p>
       <w:pPr>
@@ -3220,10 +3311,10 @@
           <w:rFonts w:ascii="Times New Roman" w:hAnsi="Times New Roman" w:cs="Times New Roman"/>
         </w:rPr>
         <w:drawing>
-          <wp:inline distT="0" distB="0" distL="0" distR="0" wp14:anchorId="2BD798DC" wp14:editId="4A6F9535">
-            <wp:extent cx="3441865" cy="2686050"/>
-            <wp:effectExtent l="0" t="0" r="6350" b="0"/>
-            <wp:docPr id="40339866" name="Kép 1" descr="A képen szöveg, képernyőkép, szoftver, Számítógépes ikon látható&#10;&#10;Előfordulhat, hogy az AI által létrehozott tartalom helytelen."/>
+          <wp:inline distT="0" distB="0" distL="0" distR="0" wp14:anchorId="524CFCD1" wp14:editId="5CDC0C5B">
+            <wp:extent cx="3245017" cy="2616334"/>
+            <wp:effectExtent l="0" t="0" r="0" b="0"/>
+            <wp:docPr id="2076564360" name="Kép 1" descr="A képen szöveg, elektronika, képernyőkép, képernyő látható&#10;&#10;Előfordulhat, hogy az AI által létrehozott tartalom helytelen."/>
             <wp:cNvGraphicFramePr>
               <a:graphicFrameLocks xmlns:a="http://schemas.openxmlformats.org/drawingml/2006/main" noChangeAspect="1"/>
             </wp:cNvGraphicFramePr>
@@ -3231,7 +3322,7 @@
               <a:graphicData uri="http://schemas.openxmlformats.org/drawingml/2006/picture">
                 <pic:pic xmlns:pic="http://schemas.openxmlformats.org/drawingml/2006/picture">
                   <pic:nvPicPr>
-                    <pic:cNvPr id="40339866" name="Kép 1" descr="A képen szöveg, képernyőkép, szoftver, Számítógépes ikon látható&#10;&#10;Előfordulhat, hogy az AI által létrehozott tartalom helytelen."/>
+                    <pic:cNvPr id="2076564360" name="Kép 1" descr="A képen szöveg, elektronika, képernyőkép, képernyő látható&#10;&#10;Előfordulhat, hogy az AI által létrehozott tartalom helytelen."/>
                     <pic:cNvPicPr/>
                   </pic:nvPicPr>
                   <pic:blipFill>
@@ -3243,7 +3334,7 @@
                   <pic:spPr>
                     <a:xfrm>
                       <a:off x="0" y="0"/>
-                      <a:ext cx="3449634" cy="2692113"/>
+                      <a:ext cx="3245017" cy="2616334"/>
                     </a:xfrm>
                     <a:prstGeom prst="rect">
                       <a:avLst/>
@@ -3267,11 +3358,12 @@
         <w:rPr>
           <w:rFonts w:ascii="Times New Roman" w:hAnsi="Times New Roman" w:cs="Times New Roman"/>
         </w:rPr>
+        <w:lastRenderedPageBreak/>
         <w:drawing>
-          <wp:inline distT="0" distB="0" distL="0" distR="0" wp14:anchorId="0C0A6865" wp14:editId="6C3EB9DA">
-            <wp:extent cx="3403600" cy="2654454"/>
-            <wp:effectExtent l="0" t="0" r="6350" b="0"/>
-            <wp:docPr id="546250281" name="Kép 1" descr="A képen szöveg, elektronika, képernyőkép, szoftver látható&#10;&#10;Előfordulhat, hogy az AI által létrehozott tartalom helytelen."/>
+          <wp:inline distT="0" distB="0" distL="0" distR="0" wp14:anchorId="08CCE66F" wp14:editId="1B41FD11">
+            <wp:extent cx="3257717" cy="2654436"/>
+            <wp:effectExtent l="0" t="0" r="0" b="0"/>
+            <wp:docPr id="764830594" name="Kép 1" descr="A képen szöveg, elektronika, képernyőkép, képernyő látható&#10;&#10;Előfordulhat, hogy az AI által létrehozott tartalom helytelen."/>
             <wp:cNvGraphicFramePr>
               <a:graphicFrameLocks xmlns:a="http://schemas.openxmlformats.org/drawingml/2006/main" noChangeAspect="1"/>
             </wp:cNvGraphicFramePr>
@@ -3279,7 +3371,7 @@
               <a:graphicData uri="http://schemas.openxmlformats.org/drawingml/2006/picture">
                 <pic:pic xmlns:pic="http://schemas.openxmlformats.org/drawingml/2006/picture">
                   <pic:nvPicPr>
-                    <pic:cNvPr id="546250281" name="Kép 1" descr="A képen szöveg, elektronika, képernyőkép, szoftver látható&#10;&#10;Előfordulhat, hogy az AI által létrehozott tartalom helytelen."/>
+                    <pic:cNvPr id="764830594" name="Kép 1" descr="A képen szöveg, elektronika, képernyőkép, képernyő látható&#10;&#10;Előfordulhat, hogy az AI által létrehozott tartalom helytelen."/>
                     <pic:cNvPicPr/>
                   </pic:nvPicPr>
                   <pic:blipFill>
@@ -3291,7 +3383,7 @@
                   <pic:spPr>
                     <a:xfrm>
                       <a:off x="0" y="0"/>
-                      <a:ext cx="3408538" cy="2658305"/>
+                      <a:ext cx="3257717" cy="2654436"/>
                     </a:xfrm>
                     <a:prstGeom prst="rect">
                       <a:avLst/>
@@ -3306,22 +3398,125 @@
     </w:p>
     <w:p>
       <w:pPr>
-        <w:rPr>
-          <w:rFonts w:ascii="Times New Roman" w:hAnsi="Times New Roman" w:cs="Times New Roman"/>
-        </w:rPr>
-      </w:pPr>
-    </w:p>
-    <w:p>
-      <w:pPr>
-        <w:rPr>
-          <w:rFonts w:ascii="Times New Roman" w:hAnsi="Times New Roman" w:cs="Times New Roman"/>
-        </w:rPr>
-      </w:pPr>
-      <w:r>
-        <w:rPr>
-          <w:rFonts w:ascii="Times New Roman" w:hAnsi="Times New Roman" w:cs="Times New Roman"/>
-        </w:rPr>
-        <w:lastRenderedPageBreak/>
+        <w:jc w:val="center"/>
+        <w:rPr>
+          <w:rFonts w:ascii="Times New Roman" w:hAnsi="Times New Roman" w:cs="Times New Roman"/>
+        </w:rPr>
+      </w:pPr>
+      <w:r>
+        <w:rPr>
+          <w:rFonts w:ascii="Times New Roman" w:hAnsi="Times New Roman" w:cs="Times New Roman"/>
+        </w:rPr>
+        <w:drawing>
+          <wp:inline distT="0" distB="0" distL="0" distR="0" wp14:anchorId="02EA5C5B" wp14:editId="50E34DC1">
+            <wp:extent cx="3264068" cy="2673487"/>
+            <wp:effectExtent l="0" t="0" r="0" b="0"/>
+            <wp:docPr id="330312182" name="Kép 1" descr="A képen szöveg, elektronika, képernyőkép, Betűtípus látható&#10;&#10;Előfordulhat, hogy az AI által létrehozott tartalom helytelen."/>
+            <wp:cNvGraphicFramePr>
+              <a:graphicFrameLocks xmlns:a="http://schemas.openxmlformats.org/drawingml/2006/main" noChangeAspect="1"/>
+            </wp:cNvGraphicFramePr>
+            <a:graphic xmlns:a="http://schemas.openxmlformats.org/drawingml/2006/main">
+              <a:graphicData uri="http://schemas.openxmlformats.org/drawingml/2006/picture">
+                <pic:pic xmlns:pic="http://schemas.openxmlformats.org/drawingml/2006/picture">
+                  <pic:nvPicPr>
+                    <pic:cNvPr id="330312182" name="Kép 1" descr="A képen szöveg, elektronika, képernyőkép, Betűtípus látható&#10;&#10;Előfordulhat, hogy az AI által létrehozott tartalom helytelen."/>
+                    <pic:cNvPicPr/>
+                  </pic:nvPicPr>
+                  <pic:blipFill>
+                    <a:blip r:embed="rId26"/>
+                    <a:stretch>
+                      <a:fillRect/>
+                    </a:stretch>
+                  </pic:blipFill>
+                  <pic:spPr>
+                    <a:xfrm>
+                      <a:off x="0" y="0"/>
+                      <a:ext cx="3264068" cy="2673487"/>
+                    </a:xfrm>
+                    <a:prstGeom prst="rect">
+                      <a:avLst/>
+                    </a:prstGeom>
+                  </pic:spPr>
+                </pic:pic>
+              </a:graphicData>
+            </a:graphic>
+          </wp:inline>
+        </w:drawing>
+      </w:r>
+    </w:p>
+    <w:p>
+      <w:pPr>
+        <w:jc w:val="center"/>
+        <w:rPr>
+          <w:rFonts w:ascii="Times New Roman" w:hAnsi="Times New Roman" w:cs="Times New Roman"/>
+        </w:rPr>
+      </w:pPr>
+      <w:r>
+        <w:rPr>
+          <w:rFonts w:ascii="Times New Roman" w:hAnsi="Times New Roman" w:cs="Times New Roman"/>
+        </w:rPr>
+        <w:drawing>
+          <wp:inline distT="0" distB="0" distL="0" distR="0" wp14:anchorId="0B365CA7" wp14:editId="2772AECB">
+            <wp:extent cx="3206915" cy="2673487"/>
+            <wp:effectExtent l="0" t="0" r="0" b="0"/>
+            <wp:docPr id="2129052126" name="Kép 1" descr="A képen szöveg, képernyőkép, képernyő, szoftver látható&#10;&#10;Előfordulhat, hogy az AI által létrehozott tartalom helytelen."/>
+            <wp:cNvGraphicFramePr>
+              <a:graphicFrameLocks xmlns:a="http://schemas.openxmlformats.org/drawingml/2006/main" noChangeAspect="1"/>
+            </wp:cNvGraphicFramePr>
+            <a:graphic xmlns:a="http://schemas.openxmlformats.org/drawingml/2006/main">
+              <a:graphicData uri="http://schemas.openxmlformats.org/drawingml/2006/picture">
+                <pic:pic xmlns:pic="http://schemas.openxmlformats.org/drawingml/2006/picture">
+                  <pic:nvPicPr>
+                    <pic:cNvPr id="2129052126" name="Kép 1" descr="A képen szöveg, képernyőkép, képernyő, szoftver látható&#10;&#10;Előfordulhat, hogy az AI által létrehozott tartalom helytelen."/>
+                    <pic:cNvPicPr/>
+                  </pic:nvPicPr>
+                  <pic:blipFill>
+                    <a:blip r:embed="rId27"/>
+                    <a:stretch>
+                      <a:fillRect/>
+                    </a:stretch>
+                  </pic:blipFill>
+                  <pic:spPr>
+                    <a:xfrm>
+                      <a:off x="0" y="0"/>
+                      <a:ext cx="3206915" cy="2673487"/>
+                    </a:xfrm>
+                    <a:prstGeom prst="rect">
+                      <a:avLst/>
+                    </a:prstGeom>
+                  </pic:spPr>
+                </pic:pic>
+              </a:graphicData>
+            </a:graphic>
+          </wp:inline>
+        </w:drawing>
+      </w:r>
+    </w:p>
+    <w:p>
+      <w:pPr>
+        <w:jc w:val="center"/>
+        <w:rPr>
+          <w:rFonts w:ascii="Times New Roman" w:hAnsi="Times New Roman" w:cs="Times New Roman"/>
+        </w:rPr>
+      </w:pPr>
+    </w:p>
+    <w:p>
+      <w:pPr>
+        <w:rPr>
+          <w:rFonts w:ascii="Times New Roman" w:hAnsi="Times New Roman" w:cs="Times New Roman"/>
+        </w:rPr>
+      </w:pPr>
+    </w:p>
+    <w:p>
+      <w:pPr>
+        <w:rPr>
+          <w:rFonts w:ascii="Times New Roman" w:hAnsi="Times New Roman" w:cs="Times New Roman"/>
+        </w:rPr>
+      </w:pPr>
+      <w:r>
+        <w:rPr>
+          <w:rFonts w:ascii="Times New Roman" w:hAnsi="Times New Roman" w:cs="Times New Roman"/>
+        </w:rPr>
         <w:t xml:space="preserve">Beállítom a DNS szerver a </w:t>
       </w:r>
       <w:proofErr w:type="spellStart"/>
@@ -3349,6 +3544,7 @@
       <w:r>
         <w:rPr>
           <w:rFonts w:ascii="Times New Roman" w:hAnsi="Times New Roman" w:cs="Times New Roman"/>
+          <w:noProof/>
         </w:rPr>
         <w:drawing>
           <wp:inline distT="0" distB="0" distL="0" distR="0" wp14:anchorId="343E4F79" wp14:editId="5E5A2F77">
@@ -3366,7 +3562,7 @@
                     <pic:cNvPicPr/>
                   </pic:nvPicPr>
                   <pic:blipFill>
-                    <a:blip r:embed="rId26"/>
+                    <a:blip r:embed="rId28"/>
                     <a:stretch>
                       <a:fillRect/>
                     </a:stretch>
@@ -3389,6 +3585,54 @@
     </w:p>
     <w:p>
       <w:pPr>
+        <w:jc w:val="center"/>
+        <w:rPr>
+          <w:rFonts w:ascii="Times New Roman" w:hAnsi="Times New Roman" w:cs="Times New Roman"/>
+        </w:rPr>
+      </w:pPr>
+      <w:r>
+        <w:rPr>
+          <w:rFonts w:ascii="Times New Roman" w:hAnsi="Times New Roman" w:cs="Times New Roman"/>
+        </w:rPr>
+        <w:drawing>
+          <wp:inline distT="0" distB="0" distL="0" distR="0" wp14:anchorId="7C4613FD" wp14:editId="059A8B42">
+            <wp:extent cx="3714941" cy="2502029"/>
+            <wp:effectExtent l="0" t="0" r="0" b="0"/>
+            <wp:docPr id="1161597860" name="Kép 1" descr="A képen szöveg, képernyőkép, szoftver, Számítógépes ikon látható&#10;&#10;Előfordulhat, hogy az AI által létrehozott tartalom helytelen."/>
+            <wp:cNvGraphicFramePr>
+              <a:graphicFrameLocks xmlns:a="http://schemas.openxmlformats.org/drawingml/2006/main" noChangeAspect="1"/>
+            </wp:cNvGraphicFramePr>
+            <a:graphic xmlns:a="http://schemas.openxmlformats.org/drawingml/2006/main">
+              <a:graphicData uri="http://schemas.openxmlformats.org/drawingml/2006/picture">
+                <pic:pic xmlns:pic="http://schemas.openxmlformats.org/drawingml/2006/picture">
+                  <pic:nvPicPr>
+                    <pic:cNvPr id="1161597860" name="Kép 1" descr="A képen szöveg, képernyőkép, szoftver, Számítógépes ikon látható&#10;&#10;Előfordulhat, hogy az AI által létrehozott tartalom helytelen."/>
+                    <pic:cNvPicPr/>
+                  </pic:nvPicPr>
+                  <pic:blipFill>
+                    <a:blip r:embed="rId29"/>
+                    <a:stretch>
+                      <a:fillRect/>
+                    </a:stretch>
+                  </pic:blipFill>
+                  <pic:spPr>
+                    <a:xfrm>
+                      <a:off x="0" y="0"/>
+                      <a:ext cx="3714941" cy="2502029"/>
+                    </a:xfrm>
+                    <a:prstGeom prst="rect">
+                      <a:avLst/>
+                    </a:prstGeom>
+                  </pic:spPr>
+                </pic:pic>
+              </a:graphicData>
+            </a:graphic>
+          </wp:inline>
+        </w:drawing>
+      </w:r>
+    </w:p>
+    <w:p>
+      <w:pPr>
         <w:rPr>
           <w:rFonts w:ascii="Times New Roman" w:hAnsi="Times New Roman" w:cs="Times New Roman"/>
         </w:rPr>
@@ -3417,6 +3661,109 @@
     </w:p>
     <w:p>
       <w:pPr>
+        <w:rPr>
+          <w:rFonts w:ascii="Times New Roman" w:hAnsi="Times New Roman" w:cs="Times New Roman"/>
+        </w:rPr>
+      </w:pPr>
+      <w:r>
+        <w:rPr>
+          <w:rFonts w:ascii="Times New Roman" w:hAnsi="Times New Roman" w:cs="Times New Roman"/>
+        </w:rPr>
+        <w:t xml:space="preserve">A második adapter az egy </w:t>
+      </w:r>
+      <w:proofErr w:type="spellStart"/>
+      <w:r>
+        <w:rPr>
+          <w:rFonts w:ascii="Times New Roman" w:hAnsi="Times New Roman" w:cs="Times New Roman"/>
+        </w:rPr>
+        <w:t>host-only</w:t>
+      </w:r>
+      <w:proofErr w:type="spellEnd"/>
+      <w:r>
+        <w:rPr>
+          <w:rFonts w:ascii="Times New Roman" w:hAnsi="Times New Roman" w:cs="Times New Roman"/>
+        </w:rPr>
+        <w:t xml:space="preserve"> kártya, ahogy a </w:t>
+      </w:r>
+      <w:proofErr w:type="spellStart"/>
+      <w:r>
+        <w:rPr>
+          <w:rFonts w:ascii="Times New Roman" w:hAnsi="Times New Roman" w:cs="Times New Roman"/>
+        </w:rPr>
+        <w:t>windows</w:t>
+      </w:r>
+      <w:proofErr w:type="spellEnd"/>
+      <w:r>
+        <w:rPr>
+          <w:rFonts w:ascii="Times New Roman" w:hAnsi="Times New Roman" w:cs="Times New Roman"/>
+        </w:rPr>
+        <w:t xml:space="preserve"> kliensen is. Ezzel tudnak majd kommunikálni egymással, </w:t>
+      </w:r>
+      <w:r>
+        <w:rPr>
+          <w:rFonts w:ascii="Times New Roman" w:hAnsi="Times New Roman" w:cs="Times New Roman"/>
+        </w:rPr>
+        <w:t xml:space="preserve">innen oszt majd </w:t>
+      </w:r>
+      <w:proofErr w:type="spellStart"/>
+      <w:r>
+        <w:rPr>
+          <w:rFonts w:ascii="Times New Roman" w:hAnsi="Times New Roman" w:cs="Times New Roman"/>
+        </w:rPr>
+        <w:t>ip</w:t>
+      </w:r>
+      <w:proofErr w:type="spellEnd"/>
+      <w:r>
+        <w:rPr>
+          <w:rFonts w:ascii="Times New Roman" w:hAnsi="Times New Roman" w:cs="Times New Roman"/>
+        </w:rPr>
+        <w:t xml:space="preserve">-címet a </w:t>
+      </w:r>
+      <w:proofErr w:type="spellStart"/>
+      <w:r>
+        <w:rPr>
+          <w:rFonts w:ascii="Times New Roman" w:hAnsi="Times New Roman" w:cs="Times New Roman"/>
+        </w:rPr>
+        <w:t>dhcp</w:t>
+      </w:r>
+      <w:proofErr w:type="spellEnd"/>
+      <w:r>
+        <w:rPr>
+          <w:rFonts w:ascii="Times New Roman" w:hAnsi="Times New Roman" w:cs="Times New Roman"/>
+        </w:rPr>
+        <w:t xml:space="preserve"> szerver a kliens gépnek, ami egy </w:t>
+      </w:r>
+      <w:proofErr w:type="spellStart"/>
+      <w:r>
+        <w:rPr>
+          <w:rFonts w:ascii="Times New Roman" w:hAnsi="Times New Roman" w:cs="Times New Roman"/>
+        </w:rPr>
+        <w:t>windows</w:t>
+      </w:r>
+      <w:proofErr w:type="spellEnd"/>
+      <w:r>
+        <w:rPr>
+          <w:rFonts w:ascii="Times New Roman" w:hAnsi="Times New Roman" w:cs="Times New Roman"/>
+        </w:rPr>
+        <w:t xml:space="preserve"> 11 </w:t>
+      </w:r>
+      <w:proofErr w:type="spellStart"/>
+      <w:r>
+        <w:rPr>
+          <w:rFonts w:ascii="Times New Roman" w:hAnsi="Times New Roman" w:cs="Times New Roman"/>
+        </w:rPr>
+        <w:t>vm</w:t>
+      </w:r>
+      <w:proofErr w:type="spellEnd"/>
+      <w:r>
+        <w:rPr>
+          <w:rFonts w:ascii="Times New Roman" w:hAnsi="Times New Roman" w:cs="Times New Roman"/>
+        </w:rPr>
+        <w:t xml:space="preserve">. </w:t>
+      </w:r>
+    </w:p>
+    <w:p>
+      <w:pPr>
         <w:jc w:val="center"/>
         <w:rPr>
           <w:rFonts w:ascii="Times New Roman" w:hAnsi="Times New Roman" w:cs="Times New Roman"/>
@@ -3425,7 +3772,9 @@
       <w:r>
         <w:rPr>
           <w:rFonts w:ascii="Times New Roman" w:hAnsi="Times New Roman" w:cs="Times New Roman"/>
-        </w:rPr>
+          <w:noProof/>
+        </w:rPr>
+        <w:lastRenderedPageBreak/>
         <w:drawing>
           <wp:inline distT="0" distB="0" distL="0" distR="0" wp14:anchorId="23BA3B3F" wp14:editId="5DDCAB05">
             <wp:extent cx="5359675" cy="2844946"/>
@@ -3442,7 +3791,7 @@
                     <pic:cNvPicPr/>
                   </pic:nvPicPr>
                   <pic:blipFill>
-                    <a:blip r:embed="rId27"/>
+                    <a:blip r:embed="rId30"/>
                     <a:stretch>
                       <a:fillRect/>
                     </a:stretch>
@@ -3473,8 +3822,8 @@
       <w:r>
         <w:rPr>
           <w:rFonts w:ascii="Times New Roman" w:hAnsi="Times New Roman" w:cs="Times New Roman"/>
-        </w:rPr>
-        <w:lastRenderedPageBreak/>
+          <w:noProof/>
+        </w:rPr>
         <w:drawing>
           <wp:inline distT="0" distB="0" distL="0" distR="0" wp14:anchorId="36CECF0E" wp14:editId="4DCF5D03">
             <wp:extent cx="5397777" cy="2825895"/>
@@ -3491,7 +3840,7 @@
                     <pic:cNvPicPr/>
                   </pic:nvPicPr>
                   <pic:blipFill>
-                    <a:blip r:embed="rId28"/>
+                    <a:blip r:embed="rId31"/>
                     <a:stretch>
                       <a:fillRect/>
                     </a:stretch>
@@ -3514,6 +3863,147 @@
     </w:p>
     <w:p>
       <w:pPr>
+        <w:jc w:val="both"/>
+        <w:rPr>
+          <w:rFonts w:ascii="Times New Roman" w:hAnsi="Times New Roman" w:cs="Times New Roman"/>
+        </w:rPr>
+      </w:pPr>
+    </w:p>
+    <w:p>
+      <w:pPr>
+        <w:jc w:val="both"/>
+        <w:rPr>
+          <w:rFonts w:ascii="Times New Roman" w:hAnsi="Times New Roman" w:cs="Times New Roman"/>
+        </w:rPr>
+      </w:pPr>
+    </w:p>
+    <w:p>
+      <w:pPr>
+        <w:jc w:val="both"/>
+        <w:rPr>
+          <w:rFonts w:ascii="Times New Roman" w:hAnsi="Times New Roman" w:cs="Times New Roman"/>
+        </w:rPr>
+      </w:pPr>
+    </w:p>
+    <w:p>
+      <w:pPr>
+        <w:jc w:val="both"/>
+        <w:rPr>
+          <w:rFonts w:ascii="Times New Roman" w:hAnsi="Times New Roman" w:cs="Times New Roman"/>
+        </w:rPr>
+      </w:pPr>
+    </w:p>
+    <w:p>
+      <w:pPr>
+        <w:jc w:val="both"/>
+        <w:rPr>
+          <w:rFonts w:ascii="Times New Roman" w:hAnsi="Times New Roman" w:cs="Times New Roman"/>
+        </w:rPr>
+      </w:pPr>
+    </w:p>
+    <w:p>
+      <w:pPr>
+        <w:jc w:val="both"/>
+        <w:rPr>
+          <w:rFonts w:ascii="Times New Roman" w:hAnsi="Times New Roman" w:cs="Times New Roman"/>
+        </w:rPr>
+      </w:pPr>
+    </w:p>
+    <w:p>
+      <w:pPr>
+        <w:jc w:val="both"/>
+        <w:rPr>
+          <w:rFonts w:ascii="Times New Roman" w:hAnsi="Times New Roman" w:cs="Times New Roman"/>
+        </w:rPr>
+      </w:pPr>
+    </w:p>
+    <w:p>
+      <w:pPr>
+        <w:jc w:val="both"/>
+        <w:rPr>
+          <w:rFonts w:ascii="Times New Roman" w:hAnsi="Times New Roman" w:cs="Times New Roman"/>
+        </w:rPr>
+      </w:pPr>
+    </w:p>
+    <w:p>
+      <w:pPr>
+        <w:jc w:val="both"/>
+        <w:rPr>
+          <w:rFonts w:ascii="Times New Roman" w:hAnsi="Times New Roman" w:cs="Times New Roman"/>
+        </w:rPr>
+      </w:pPr>
+    </w:p>
+    <w:p>
+      <w:pPr>
+        <w:jc w:val="both"/>
+        <w:rPr>
+          <w:rFonts w:ascii="Times New Roman" w:hAnsi="Times New Roman" w:cs="Times New Roman"/>
+        </w:rPr>
+      </w:pPr>
+      <w:r>
+        <w:rPr>
+          <w:rFonts w:ascii="Times New Roman" w:hAnsi="Times New Roman" w:cs="Times New Roman"/>
+        </w:rPr>
+        <w:lastRenderedPageBreak/>
+        <w:t>A szervere</w:t>
+      </w:r>
+      <w:r>
+        <w:rPr>
+          <w:rFonts w:ascii="Times New Roman" w:hAnsi="Times New Roman" w:cs="Times New Roman"/>
+        </w:rPr>
+        <w:t>n az Ether2-es adaptert bekonfiguráltam egy másik címre, a 192.168.56.1-re</w:t>
+      </w:r>
+      <w:r>
+        <w:rPr>
+          <w:rFonts w:ascii="Times New Roman" w:hAnsi="Times New Roman" w:cs="Times New Roman"/>
+        </w:rPr>
+        <w:t xml:space="preserve">, innen fog </w:t>
+      </w:r>
+      <w:proofErr w:type="spellStart"/>
+      <w:r>
+        <w:rPr>
+          <w:rFonts w:ascii="Times New Roman" w:hAnsi="Times New Roman" w:cs="Times New Roman"/>
+        </w:rPr>
+        <w:t>ip</w:t>
+      </w:r>
+      <w:proofErr w:type="spellEnd"/>
+      <w:r>
+        <w:rPr>
+          <w:rFonts w:ascii="Times New Roman" w:hAnsi="Times New Roman" w:cs="Times New Roman"/>
+        </w:rPr>
+        <w:t xml:space="preserve">-cím jönni a </w:t>
+      </w:r>
+      <w:proofErr w:type="spellStart"/>
+      <w:r>
+        <w:rPr>
+          <w:rFonts w:ascii="Times New Roman" w:hAnsi="Times New Roman" w:cs="Times New Roman"/>
+        </w:rPr>
+        <w:t>dhcp-től</w:t>
+      </w:r>
+      <w:proofErr w:type="spellEnd"/>
+      <w:r>
+        <w:rPr>
+          <w:rFonts w:ascii="Times New Roman" w:hAnsi="Times New Roman" w:cs="Times New Roman"/>
+        </w:rPr>
+        <w:t xml:space="preserve">, ahogy láthattuk a </w:t>
+      </w:r>
+      <w:proofErr w:type="spellStart"/>
+      <w:r>
+        <w:rPr>
+          <w:rFonts w:ascii="Times New Roman" w:hAnsi="Times New Roman" w:cs="Times New Roman"/>
+        </w:rPr>
+        <w:t>scope</w:t>
+      </w:r>
+      <w:proofErr w:type="spellEnd"/>
+      <w:r>
+        <w:rPr>
+          <w:rFonts w:ascii="Times New Roman" w:hAnsi="Times New Roman" w:cs="Times New Roman"/>
+        </w:rPr>
+        <w:t xml:space="preserve"> már erre a címre lett felkonfigurálva. </w:t>
+      </w:r>
+    </w:p>
+    <w:p>
+      <w:pPr>
         <w:jc w:val="center"/>
         <w:rPr>
           <w:rFonts w:ascii="Times New Roman" w:hAnsi="Times New Roman" w:cs="Times New Roman"/>
@@ -3524,10 +4014,10 @@
           <w:rFonts w:ascii="Times New Roman" w:hAnsi="Times New Roman" w:cs="Times New Roman"/>
         </w:rPr>
         <w:drawing>
-          <wp:inline distT="0" distB="0" distL="0" distR="0" wp14:anchorId="40D4EAF8" wp14:editId="378F45AC">
-            <wp:extent cx="5391427" cy="2800494"/>
+          <wp:inline distT="0" distB="0" distL="0" distR="0" wp14:anchorId="3850D089" wp14:editId="79F5F321">
+            <wp:extent cx="2521080" cy="2844946"/>
             <wp:effectExtent l="0" t="0" r="0" b="0"/>
-            <wp:docPr id="1253790915" name="Kép 1" descr="A képen szöveg, képernyőkép, szoftver, képernyő látható&#10;&#10;Előfordulhat, hogy az AI által létrehozott tartalom helytelen."/>
+            <wp:docPr id="1751497250" name="Kép 1" descr="A képen szöveg, képernyőkép, képernyő, szám látható&#10;&#10;Előfordulhat, hogy az AI által létrehozott tartalom helytelen."/>
             <wp:cNvGraphicFramePr>
               <a:graphicFrameLocks xmlns:a="http://schemas.openxmlformats.org/drawingml/2006/main" noChangeAspect="1"/>
             </wp:cNvGraphicFramePr>
@@ -3535,11 +4025,11 @@
               <a:graphicData uri="http://schemas.openxmlformats.org/drawingml/2006/picture">
                 <pic:pic xmlns:pic="http://schemas.openxmlformats.org/drawingml/2006/picture">
                   <pic:nvPicPr>
-                    <pic:cNvPr id="1253790915" name="Kép 1" descr="A képen szöveg, képernyőkép, szoftver, képernyő látható&#10;&#10;Előfordulhat, hogy az AI által létrehozott tartalom helytelen."/>
+                    <pic:cNvPr id="1751497250" name="Kép 1" descr="A képen szöveg, képernyőkép, képernyő, szám látható&#10;&#10;Előfordulhat, hogy az AI által létrehozott tartalom helytelen."/>
                     <pic:cNvPicPr/>
                   </pic:nvPicPr>
                   <pic:blipFill>
-                    <a:blip r:embed="rId29"/>
+                    <a:blip r:embed="rId32"/>
                     <a:stretch>
                       <a:fillRect/>
                     </a:stretch>
@@ -3547,7 +4037,7 @@
                   <pic:spPr>
                     <a:xfrm>
                       <a:off x="0" y="0"/>
-                      <a:ext cx="5391427" cy="2800494"/>
+                      <a:ext cx="2521080" cy="2844946"/>
                     </a:xfrm>
                     <a:prstGeom prst="rect">
                       <a:avLst/>
@@ -3562,17 +4052,47 @@
     </w:p>
     <w:p>
       <w:pPr>
+        <w:jc w:val="both"/>
+        <w:rPr>
+          <w:rFonts w:ascii="Times New Roman" w:hAnsi="Times New Roman" w:cs="Times New Roman"/>
+        </w:rPr>
+      </w:pPr>
+      <w:r>
+        <w:rPr>
+          <w:rFonts w:ascii="Times New Roman" w:hAnsi="Times New Roman" w:cs="Times New Roman"/>
+        </w:rPr>
+        <w:t xml:space="preserve">Most jön a </w:t>
+      </w:r>
+      <w:proofErr w:type="spellStart"/>
+      <w:r>
+        <w:rPr>
+          <w:rFonts w:ascii="Times New Roman" w:hAnsi="Times New Roman" w:cs="Times New Roman"/>
+        </w:rPr>
+        <w:t>windows</w:t>
+      </w:r>
+      <w:proofErr w:type="spellEnd"/>
+      <w:r>
+        <w:rPr>
+          <w:rFonts w:ascii="Times New Roman" w:hAnsi="Times New Roman" w:cs="Times New Roman"/>
+        </w:rPr>
+        <w:t xml:space="preserve"> kliens </w:t>
+      </w:r>
+    </w:p>
+    <w:p>
+      <w:pPr>
         <w:jc w:val="center"/>
         <w:rPr>
           <w:rFonts w:ascii="Times New Roman" w:hAnsi="Times New Roman" w:cs="Times New Roman"/>
         </w:rPr>
       </w:pPr>
-      <w:r>
-        <w:rPr>
-          <w:rFonts w:ascii="Times New Roman" w:hAnsi="Times New Roman" w:cs="Times New Roman"/>
-        </w:rPr>
-        <w:t xml:space="preserve">sajnos még nem működik valamiért gyakorlatban a DHCP szerver, pedig a configok elvileg jók! </w:t>
-      </w:r>
+    </w:p>
+    <w:p>
+      <w:pPr>
+        <w:jc w:val="center"/>
+        <w:rPr>
+          <w:rFonts w:ascii="Times New Roman" w:hAnsi="Times New Roman" w:cs="Times New Roman"/>
+        </w:rPr>
+      </w:pPr>
     </w:p>
     <w:p>
       <w:pPr>
@@ -3638,7 +4158,7 @@
       </w:pPr>
     </w:p>
     <w:sectPr>
-      <w:headerReference w:type="default" r:id="rId30"/>
+      <w:headerReference w:type="default" r:id="rId33"/>
       <w:pgSz w:w="11906" w:h="16838"/>
       <w:pgMar w:top="1417" w:right="1417" w:bottom="1417" w:left="1417" w:header="708" w:footer="708" w:gutter="0"/>
       <w:cols w:space="708"/>
@@ -5345,6 +5865,7 @@
   <w:style w:type="character" w:default="1" w:styleId="Bekezdsalapbettpusa">
     <w:name w:val="Default Paragraph Font"/>
     <w:uiPriority w:val="1"/>
+    <w:semiHidden/>
     <w:unhideWhenUsed/>
   </w:style>
   <w:style w:type="table" w:default="1" w:styleId="Normltblzat">

</xml_diff>